<commit_message>
all except zerfu and the new ones
</commit_message>
<xml_diff>
--- a/lost mezmurs.docx
+++ b/lost mezmurs.docx
@@ -130,15 +130,6 @@
           <w:lang w:val="en-US"/>
         </w:rPr>
       </w:pPr>
-      <w:r>
-        <w:rPr>
-          <w:rFonts w:hint="default" w:ascii="Noto Sans Ethiopic" w:hAnsi="Noto Sans Ethiopic" w:cs="Noto Sans Ethiopic"/>
-          <w:sz w:val="22"/>
-          <w:szCs w:val="22"/>
-          <w:lang w:val="en-US"/>
-        </w:rPr>
-        <w:t>14.json - ዋኔን</w:t>
-      </w:r>
     </w:p>
     <w:p>
       <w:pPr>
@@ -161,7 +152,7 @@
           <w:szCs w:val="22"/>
           <w:lang w:val="en-US"/>
         </w:rPr>
-        <w:t>15.json - ይበላሃላ - not found</w:t>
+        <w:t>ደምሴ ደስታ</w:t>
       </w:r>
     </w:p>
     <w:p>
@@ -185,7 +176,7 @@
           <w:szCs w:val="22"/>
           <w:lang w:val="en-US"/>
         </w:rPr>
-        <w:t>17.json - እስመ አንተ - not found</w:t>
+        <w:t>1.json - ጻድቅ ኢትዮጵያ - not found</w:t>
       </w:r>
     </w:p>
     <w:p>
@@ -202,69 +193,6 @@
           <w:lang w:val="en-US"/>
         </w:rPr>
       </w:pPr>
-    </w:p>
-    <w:p>
-      <w:pPr>
-        <w:numPr>
-          <w:ilvl w:val="0"/>
-          <w:numId w:val="0"/>
-        </w:numPr>
-        <w:ind w:leftChars="0"/>
-        <w:rPr>
-          <w:rFonts w:hint="default" w:ascii="Noto Sans Ethiopic" w:hAnsi="Noto Sans Ethiopic" w:cs="Noto Sans Ethiopic"/>
-          <w:sz w:val="22"/>
-          <w:szCs w:val="22"/>
-          <w:lang w:val="en-US"/>
-        </w:rPr>
-      </w:pPr>
-      <w:r>
-        <w:rPr>
-          <w:rFonts w:hint="default" w:ascii="Noto Sans Ethiopic" w:hAnsi="Noto Sans Ethiopic" w:cs="Noto Sans Ethiopic"/>
-          <w:sz w:val="22"/>
-          <w:szCs w:val="22"/>
-          <w:lang w:val="en-US"/>
-        </w:rPr>
-        <w:t>ደምሴ ደስታ</w:t>
-      </w:r>
-    </w:p>
-    <w:p>
-      <w:pPr>
-        <w:numPr>
-          <w:ilvl w:val="0"/>
-          <w:numId w:val="0"/>
-        </w:numPr>
-        <w:ind w:leftChars="0"/>
-        <w:rPr>
-          <w:rFonts w:hint="default" w:ascii="Noto Sans Ethiopic" w:hAnsi="Noto Sans Ethiopic" w:cs="Noto Sans Ethiopic"/>
-          <w:sz w:val="22"/>
-          <w:szCs w:val="22"/>
-          <w:lang w:val="en-US"/>
-        </w:rPr>
-      </w:pPr>
-      <w:r>
-        <w:rPr>
-          <w:rFonts w:hint="default" w:ascii="Noto Sans Ethiopic" w:hAnsi="Noto Sans Ethiopic" w:cs="Noto Sans Ethiopic"/>
-          <w:sz w:val="22"/>
-          <w:szCs w:val="22"/>
-          <w:lang w:val="en-US"/>
-        </w:rPr>
-        <w:t>1.json - ጻድቅ ኢትዮጵያ - not found</w:t>
-      </w:r>
-    </w:p>
-    <w:p>
-      <w:pPr>
-        <w:numPr>
-          <w:ilvl w:val="0"/>
-          <w:numId w:val="0"/>
-        </w:numPr>
-        <w:ind w:leftChars="0"/>
-        <w:rPr>
-          <w:rFonts w:hint="default" w:ascii="Noto Sans Ethiopic" w:hAnsi="Noto Sans Ethiopic" w:cs="Noto Sans Ethiopic"/>
-          <w:sz w:val="22"/>
-          <w:szCs w:val="22"/>
-          <w:lang w:val="en-US"/>
-        </w:rPr>
-      </w:pPr>
       <w:r>
         <w:rPr>
           <w:rFonts w:hint="default" w:ascii="Noto Sans Ethiopic" w:hAnsi="Noto Sans Ethiopic" w:cs="Noto Sans Ethiopic"/>
@@ -274,6 +202,8 @@
         </w:rPr>
         <w:t>2.json - ወላዲተ አምላክ - not found</w:t>
       </w:r>
+      <w:bookmarkStart w:id="0" w:name="_GoBack"/>
+      <w:bookmarkEnd w:id="0"/>
     </w:p>
     <w:p>
       <w:pPr>
@@ -668,37 +598,7 @@
           <w:shd w:val="clear" w:fill="1F1F1F"/>
           <w:lang w:val="en-US" w:eastAsia="zh-CN" w:bidi="ar"/>
         </w:rPr>
-        <w:t>"</w:t>
-      </w:r>
-      <w:bookmarkStart w:id="0" w:name="_GoBack"/>
-      <w:r>
-        <w:rPr>
-          <w:rFonts w:hint="default" w:ascii="Consolas" w:hAnsi="Consolas" w:eastAsia="Consolas" w:cs="Consolas"/>
-          <w:b w:val="0"/>
-          <w:bCs w:val="0"/>
-          <w:color w:val="CE9178"/>
-          <w:kern w:val="0"/>
-          <w:sz w:val="14"/>
-          <w:szCs w:val="14"/>
-          <w:shd w:val="clear" w:fill="1F1F1F"/>
-          <w:lang w:val="en-US" w:eastAsia="zh-CN" w:bidi="ar"/>
-        </w:rPr>
-        <w:t>የተከፈለልኝ ውለታ</w:t>
-      </w:r>
-      <w:bookmarkEnd w:id="0"/>
-      <w:r>
-        <w:rPr>
-          <w:rFonts w:hint="default" w:ascii="Consolas" w:hAnsi="Consolas" w:eastAsia="Consolas" w:cs="Consolas"/>
-          <w:b w:val="0"/>
-          <w:bCs w:val="0"/>
-          <w:color w:val="CE9178"/>
-          <w:kern w:val="0"/>
-          <w:sz w:val="14"/>
-          <w:szCs w:val="14"/>
-          <w:shd w:val="clear" w:fill="1F1F1F"/>
-          <w:lang w:val="en-US" w:eastAsia="zh-CN" w:bidi="ar"/>
-        </w:rPr>
-        <w:t>"</w:t>
+        <w:t>"የተከፈለልኝ ውለታ"</w:t>
       </w:r>
       <w:r>
         <w:rPr>
@@ -2118,6 +2018,1007 @@
           <w:rFonts w:hint="default" w:ascii="Noto Sans Ethiopic" w:hAnsi="Noto Sans Ethiopic" w:cs="Noto Sans Ethiopic"/>
           <w:sz w:val="22"/>
           <w:szCs w:val="22"/>
+          <w:lang w:val="en-US"/>
+        </w:rPr>
+      </w:pPr>
+    </w:p>
+    <w:p>
+      <w:pPr>
+        <w:numPr>
+          <w:ilvl w:val="0"/>
+          <w:numId w:val="0"/>
+        </w:numPr>
+        <w:ind w:leftChars="0"/>
+        <w:rPr>
+          <w:rFonts w:hint="default" w:ascii="Noto Sans Ethiopic" w:hAnsi="Noto Sans Ethiopic" w:cs="Noto Sans Ethiopic"/>
+          <w:sz w:val="22"/>
+          <w:szCs w:val="22"/>
+          <w:lang w:val="en-US"/>
+        </w:rPr>
+      </w:pPr>
+      <w:r>
+        <w:rPr>
+          <w:rFonts w:hint="default" w:ascii="Noto Sans Ethiopic" w:hAnsi="Noto Sans Ethiopic" w:cs="Noto Sans Ethiopic"/>
+          <w:sz w:val="22"/>
+          <w:szCs w:val="22"/>
+          <w:lang w:val="en-US"/>
+        </w:rPr>
+        <w:t>ታፈሰ ተስፋዬ</w:t>
+      </w:r>
+    </w:p>
+    <w:p>
+      <w:pPr>
+        <w:numPr>
+          <w:ilvl w:val="0"/>
+          <w:numId w:val="0"/>
+        </w:numPr>
+        <w:ind w:leftChars="0"/>
+        <w:rPr>
+          <w:rFonts w:hint="default" w:ascii="Noto Sans Ethiopic" w:hAnsi="Noto Sans Ethiopic" w:cs="Noto Sans Ethiopic"/>
+          <w:sz w:val="22"/>
+          <w:szCs w:val="22"/>
+          <w:lang w:val="en-US"/>
+        </w:rPr>
+      </w:pPr>
+      <w:r>
+        <w:rPr>
+          <w:rFonts w:hint="default" w:ascii="Noto Sans Ethiopic" w:hAnsi="Noto Sans Ethiopic" w:cs="Noto Sans Ethiopic"/>
+          <w:sz w:val="22"/>
+          <w:szCs w:val="22"/>
+          <w:lang w:val="en-US"/>
+        </w:rPr>
+        <w:t xml:space="preserve">3.json - ማን ይመራመር - </w:t>
+      </w:r>
+    </w:p>
+    <w:p>
+      <w:pPr>
+        <w:numPr>
+          <w:ilvl w:val="0"/>
+          <w:numId w:val="0"/>
+        </w:numPr>
+        <w:ind w:leftChars="0"/>
+        <w:rPr>
+          <w:rFonts w:hint="default" w:ascii="Noto Sans Ethiopic" w:hAnsi="Noto Sans Ethiopic" w:cs="Noto Sans Ethiopic"/>
+          <w:sz w:val="22"/>
+          <w:szCs w:val="22"/>
+          <w:lang w:val="en-US"/>
+        </w:rPr>
+      </w:pPr>
+    </w:p>
+    <w:p>
+      <w:pPr>
+        <w:numPr>
+          <w:ilvl w:val="0"/>
+          <w:numId w:val="0"/>
+        </w:numPr>
+        <w:ind w:leftChars="0"/>
+        <w:rPr>
+          <w:rFonts w:hint="default" w:ascii="Noto Sans Ethiopic" w:hAnsi="Noto Sans Ethiopic" w:cs="Noto Sans Ethiopic"/>
+          <w:sz w:val="22"/>
+          <w:szCs w:val="22"/>
+          <w:lang w:val="en-US"/>
+        </w:rPr>
+      </w:pPr>
+      <w:r>
+        <w:rPr>
+          <w:rFonts w:hint="default" w:ascii="Noto Sans Ethiopic" w:hAnsi="Noto Sans Ethiopic" w:cs="Noto Sans Ethiopic"/>
+          <w:sz w:val="22"/>
+          <w:szCs w:val="22"/>
+          <w:lang w:val="en-US"/>
+        </w:rPr>
+        <w:t>ይልማ</w:t>
+      </w:r>
+    </w:p>
+    <w:p>
+      <w:pPr>
+        <w:numPr>
+          <w:ilvl w:val="0"/>
+          <w:numId w:val="2"/>
+        </w:numPr>
+        <w:ind w:leftChars="0"/>
+        <w:rPr>
+          <w:rFonts w:hint="default" w:ascii="Noto Sans Ethiopic" w:hAnsi="Noto Sans Ethiopic" w:cs="Noto Sans Ethiopic"/>
+          <w:sz w:val="22"/>
+          <w:szCs w:val="22"/>
+          <w:lang w:val="en-US"/>
+        </w:rPr>
+      </w:pPr>
+      <w:r>
+        <w:rPr>
+          <w:rFonts w:hint="default" w:ascii="Noto Sans Ethiopic" w:hAnsi="Noto Sans Ethiopic" w:cs="Noto Sans Ethiopic"/>
+          <w:sz w:val="22"/>
+          <w:szCs w:val="22"/>
+          <w:lang w:val="en-US"/>
+        </w:rPr>
+        <w:t>json - ኪርያላይሶን - not found</w:t>
+      </w:r>
+    </w:p>
+    <w:p>
+      <w:pPr>
+        <w:numPr>
+          <w:numId w:val="0"/>
+        </w:numPr>
+        <w:rPr>
+          <w:rFonts w:hint="default" w:ascii="Noto Sans Ethiopic" w:hAnsi="Noto Sans Ethiopic" w:cs="Noto Sans Ethiopic"/>
+          <w:sz w:val="22"/>
+          <w:szCs w:val="22"/>
+          <w:lang w:val="en-US"/>
+        </w:rPr>
+      </w:pPr>
+    </w:p>
+    <w:p>
+      <w:pPr>
+        <w:numPr>
+          <w:numId w:val="0"/>
+        </w:numPr>
+        <w:rPr>
+          <w:rFonts w:hint="default" w:ascii="Noto Sans Ethiopic" w:hAnsi="Noto Sans Ethiopic" w:cs="Noto Sans Ethiopic"/>
+          <w:sz w:val="22"/>
+          <w:szCs w:val="22"/>
+          <w:lang w:val="en-US"/>
+        </w:rPr>
+      </w:pPr>
+      <w:r>
+        <w:rPr>
+          <w:rFonts w:hint="default" w:ascii="Noto Sans Ethiopic" w:hAnsi="Noto Sans Ethiopic" w:cs="Noto Sans Ethiopic"/>
+          <w:sz w:val="22"/>
+          <w:szCs w:val="22"/>
+          <w:lang w:val="en-US"/>
+        </w:rPr>
+        <w:t>ሶስና</w:t>
+      </w:r>
+    </w:p>
+    <w:p>
+      <w:pPr>
+        <w:numPr>
+          <w:numId w:val="0"/>
+        </w:numPr>
+        <w:rPr>
+          <w:rFonts w:hint="default" w:ascii="Noto Sans Ethiopic" w:hAnsi="Noto Sans Ethiopic" w:cs="Noto Sans Ethiopic"/>
+          <w:sz w:val="20"/>
+          <w:szCs w:val="20"/>
+          <w:lang w:val="en-US"/>
+        </w:rPr>
+      </w:pPr>
+      <w:r>
+        <w:rPr>
+          <w:rFonts w:hint="default" w:ascii="Noto Sans Ethiopic" w:hAnsi="Noto Sans Ethiopic" w:cs="Noto Sans Ethiopic"/>
+          <w:sz w:val="22"/>
+          <w:szCs w:val="22"/>
+          <w:lang w:val="en-US"/>
+        </w:rPr>
+        <w:t xml:space="preserve">2.json - </w:t>
+      </w:r>
+      <w:r>
+        <w:rPr>
+          <w:rFonts w:hint="default" w:ascii="Noto Sans Ethiopic" w:hAnsi="Noto Sans Ethiopic" w:cs="Noto Sans Ethiopic"/>
+          <w:sz w:val="20"/>
+          <w:szCs w:val="20"/>
+        </w:rPr>
+        <w:t>አንተ አይደለህም ወይ</w:t>
+      </w:r>
+      <w:r>
+        <w:rPr>
+          <w:rFonts w:hint="default" w:ascii="Noto Sans Ethiopic" w:hAnsi="Noto Sans Ethiopic" w:cs="Noto Sans Ethiopic"/>
+          <w:sz w:val="20"/>
+          <w:szCs w:val="20"/>
+          <w:lang w:val="en-US"/>
+        </w:rPr>
+        <w:t xml:space="preserve"> - </w:t>
+      </w:r>
+    </w:p>
+    <w:p>
+      <w:pPr>
+        <w:numPr>
+          <w:numId w:val="0"/>
+        </w:numPr>
+        <w:rPr>
+          <w:rFonts w:hint="default" w:ascii="Noto Sans Ethiopic" w:hAnsi="Noto Sans Ethiopic" w:cs="Noto Sans Ethiopic"/>
+          <w:sz w:val="20"/>
+          <w:szCs w:val="20"/>
+          <w:lang w:val="en-US"/>
+        </w:rPr>
+      </w:pPr>
+      <w:r>
+        <w:rPr>
+          <w:rFonts w:hint="default" w:ascii="Noto Sans Ethiopic" w:hAnsi="Noto Sans Ethiopic" w:cs="Noto Sans Ethiopic"/>
+          <w:sz w:val="20"/>
+          <w:szCs w:val="20"/>
+          <w:lang w:val="en-US"/>
+        </w:rPr>
+        <w:t>3.json - ቸሩ መድኃኔዓለም</w:t>
+      </w:r>
+    </w:p>
+    <w:p>
+      <w:pPr>
+        <w:numPr>
+          <w:numId w:val="0"/>
+        </w:numPr>
+        <w:rPr>
+          <w:rFonts w:hint="default" w:ascii="Noto Sans Ethiopic" w:hAnsi="Noto Sans Ethiopic" w:cs="Noto Sans Ethiopic"/>
+          <w:sz w:val="20"/>
+          <w:szCs w:val="20"/>
+          <w:lang w:val="en-US"/>
+        </w:rPr>
+      </w:pPr>
+      <w:r>
+        <w:rPr>
+          <w:rFonts w:hint="default" w:ascii="Noto Sans Ethiopic" w:hAnsi="Noto Sans Ethiopic" w:cs="Noto Sans Ethiopic"/>
+          <w:sz w:val="20"/>
+          <w:szCs w:val="20"/>
+          <w:lang w:val="en-US"/>
+        </w:rPr>
+        <w:t>6.json - እመቤቴ</w:t>
+      </w:r>
+    </w:p>
+    <w:p>
+      <w:pPr>
+        <w:numPr>
+          <w:numId w:val="0"/>
+        </w:numPr>
+        <w:rPr>
+          <w:rFonts w:hint="default" w:ascii="Noto Sans Ethiopic" w:hAnsi="Noto Sans Ethiopic" w:cs="Noto Sans Ethiopic"/>
+          <w:sz w:val="20"/>
+          <w:szCs w:val="20"/>
+          <w:lang w:val="en-US"/>
+        </w:rPr>
+      </w:pPr>
+    </w:p>
+    <w:p>
+      <w:pPr>
+        <w:numPr>
+          <w:numId w:val="0"/>
+        </w:numPr>
+        <w:rPr>
+          <w:rFonts w:hint="default" w:ascii="Noto Sans Ethiopic" w:hAnsi="Noto Sans Ethiopic" w:cs="Noto Sans Ethiopic"/>
+          <w:sz w:val="20"/>
+          <w:szCs w:val="20"/>
+          <w:lang w:val="en-US"/>
+        </w:rPr>
+      </w:pPr>
+      <w:r>
+        <w:rPr>
+          <w:rFonts w:hint="default" w:ascii="Noto Sans Ethiopic" w:hAnsi="Noto Sans Ethiopic" w:cs="Noto Sans Ethiopic"/>
+          <w:sz w:val="20"/>
+          <w:szCs w:val="20"/>
+          <w:lang w:val="en-US"/>
+        </w:rPr>
+        <w:t>አለቃ ተሰማ - all - not found</w:t>
+      </w:r>
+    </w:p>
+    <w:p>
+      <w:pPr>
+        <w:numPr>
+          <w:numId w:val="0"/>
+        </w:numPr>
+        <w:rPr>
+          <w:rFonts w:hint="default" w:ascii="Noto Sans Ethiopic" w:hAnsi="Noto Sans Ethiopic" w:cs="Noto Sans Ethiopic"/>
+          <w:sz w:val="20"/>
+          <w:szCs w:val="20"/>
+          <w:lang w:val="en-US"/>
+        </w:rPr>
+      </w:pPr>
+    </w:p>
+    <w:p>
+      <w:pPr>
+        <w:numPr>
+          <w:numId w:val="0"/>
+        </w:numPr>
+        <w:rPr>
+          <w:rFonts w:hint="default" w:ascii="Noto Sans Ethiopic" w:hAnsi="Noto Sans Ethiopic" w:cs="Noto Sans Ethiopic"/>
+          <w:sz w:val="20"/>
+          <w:szCs w:val="20"/>
+          <w:lang w:val="en-US"/>
+        </w:rPr>
+      </w:pPr>
+      <w:r>
+        <w:rPr>
+          <w:rFonts w:hint="default" w:ascii="Noto Sans Ethiopic" w:hAnsi="Noto Sans Ethiopic" w:cs="Noto Sans Ethiopic"/>
+          <w:sz w:val="20"/>
+          <w:szCs w:val="20"/>
+          <w:lang w:val="en-US"/>
+        </w:rPr>
+        <w:t>አለማየሁ ፋንታ</w:t>
+      </w:r>
+    </w:p>
+    <w:p>
+      <w:pPr>
+        <w:numPr>
+          <w:numId w:val="0"/>
+        </w:numPr>
+        <w:rPr>
+          <w:rFonts w:hint="default" w:ascii="Noto Sans Ethiopic" w:hAnsi="Noto Sans Ethiopic" w:cs="Noto Sans Ethiopic"/>
+          <w:sz w:val="20"/>
+          <w:szCs w:val="20"/>
+          <w:lang w:val="en-US"/>
+        </w:rPr>
+      </w:pPr>
+      <w:r>
+        <w:rPr>
+          <w:rFonts w:hint="default" w:ascii="Noto Sans Ethiopic" w:hAnsi="Noto Sans Ethiopic" w:cs="Noto Sans Ethiopic"/>
+          <w:sz w:val="20"/>
+          <w:szCs w:val="20"/>
+          <w:lang w:val="en-US"/>
+        </w:rPr>
+        <w:t>3.json - በስመ አብ - not found</w:t>
+      </w:r>
+    </w:p>
+    <w:p>
+      <w:pPr>
+        <w:numPr>
+          <w:numId w:val="0"/>
+        </w:numPr>
+        <w:rPr>
+          <w:rFonts w:hint="default" w:ascii="Noto Sans Ethiopic" w:hAnsi="Noto Sans Ethiopic" w:cs="Noto Sans Ethiopic"/>
+          <w:sz w:val="20"/>
+          <w:szCs w:val="20"/>
+          <w:lang w:val="en-US"/>
+        </w:rPr>
+      </w:pPr>
+      <w:r>
+        <w:rPr>
+          <w:rFonts w:hint="default" w:ascii="Noto Sans Ethiopic" w:hAnsi="Noto Sans Ethiopic" w:cs="Noto Sans Ethiopic"/>
+          <w:sz w:val="20"/>
+          <w:szCs w:val="20"/>
+          <w:lang w:val="en-US"/>
+        </w:rPr>
+        <w:t>4.json - እንኳን ነአኩተከ - not found</w:t>
+      </w:r>
+    </w:p>
+    <w:p>
+      <w:pPr>
+        <w:numPr>
+          <w:numId w:val="0"/>
+        </w:numPr>
+        <w:rPr>
+          <w:rFonts w:hint="default" w:ascii="Noto Sans Ethiopic" w:hAnsi="Noto Sans Ethiopic" w:cs="Noto Sans Ethiopic"/>
+          <w:sz w:val="20"/>
+          <w:szCs w:val="20"/>
+          <w:lang w:val="en-US"/>
+        </w:rPr>
+      </w:pPr>
+      <w:r>
+        <w:rPr>
+          <w:rFonts w:hint="default" w:ascii="Noto Sans Ethiopic" w:hAnsi="Noto Sans Ethiopic" w:cs="Noto Sans Ethiopic"/>
+          <w:sz w:val="20"/>
+          <w:szCs w:val="20"/>
+          <w:lang w:val="en-US"/>
+        </w:rPr>
+        <w:t>5.json - ማን ይመራመር - not found</w:t>
+      </w:r>
+    </w:p>
+    <w:p>
+      <w:pPr>
+        <w:numPr>
+          <w:numId w:val="0"/>
+        </w:numPr>
+        <w:rPr>
+          <w:rFonts w:hint="default" w:ascii="Noto Sans Ethiopic" w:hAnsi="Noto Sans Ethiopic" w:cs="Noto Sans Ethiopic"/>
+          <w:sz w:val="20"/>
+          <w:szCs w:val="20"/>
+          <w:lang w:val="en-US"/>
+        </w:rPr>
+      </w:pPr>
+      <w:r>
+        <w:rPr>
+          <w:rFonts w:hint="default" w:ascii="Noto Sans Ethiopic" w:hAnsi="Noto Sans Ethiopic" w:cs="Noto Sans Ethiopic"/>
+          <w:sz w:val="20"/>
+          <w:szCs w:val="20"/>
+          <w:lang w:val="en-US"/>
+        </w:rPr>
+        <w:t>6.json - ያወጣሀን - not found</w:t>
+      </w:r>
+    </w:p>
+    <w:p>
+      <w:pPr>
+        <w:numPr>
+          <w:numId w:val="0"/>
+        </w:numPr>
+        <w:rPr>
+          <w:rFonts w:hint="default" w:ascii="Noto Sans Ethiopic" w:hAnsi="Noto Sans Ethiopic" w:cs="Noto Sans Ethiopic"/>
+          <w:sz w:val="20"/>
+          <w:szCs w:val="20"/>
+          <w:lang w:val="en-US"/>
+        </w:rPr>
+      </w:pPr>
+      <w:r>
+        <w:rPr>
+          <w:rFonts w:hint="default" w:ascii="Noto Sans Ethiopic" w:hAnsi="Noto Sans Ethiopic" w:cs="Noto Sans Ethiopic"/>
+          <w:sz w:val="20"/>
+          <w:szCs w:val="20"/>
+          <w:lang w:val="en-US"/>
+        </w:rPr>
+        <w:t>7.json - ከቶ አይቀርም ሞቱ - not found</w:t>
+      </w:r>
+    </w:p>
+    <w:p>
+      <w:pPr>
+        <w:numPr>
+          <w:numId w:val="0"/>
+        </w:numPr>
+        <w:rPr>
+          <w:rFonts w:hint="default" w:ascii="Noto Sans Ethiopic" w:hAnsi="Noto Sans Ethiopic" w:cs="Noto Sans Ethiopic"/>
+          <w:sz w:val="20"/>
+          <w:szCs w:val="20"/>
+          <w:lang w:val="en-US"/>
+        </w:rPr>
+      </w:pPr>
+      <w:r>
+        <w:rPr>
+          <w:rFonts w:hint="default" w:ascii="Noto Sans Ethiopic" w:hAnsi="Noto Sans Ethiopic" w:cs="Noto Sans Ethiopic"/>
+          <w:sz w:val="20"/>
+          <w:szCs w:val="20"/>
+          <w:lang w:val="en-US"/>
+        </w:rPr>
+        <w:t>8.json - በእናቱ ነው እንጂ - not found</w:t>
+      </w:r>
+    </w:p>
+    <w:p>
+      <w:pPr>
+        <w:numPr>
+          <w:numId w:val="0"/>
+        </w:numPr>
+        <w:rPr>
+          <w:rFonts w:hint="default" w:ascii="Noto Sans Ethiopic" w:hAnsi="Noto Sans Ethiopic" w:cs="Noto Sans Ethiopic"/>
+          <w:sz w:val="20"/>
+          <w:szCs w:val="20"/>
+          <w:lang w:val="en-US"/>
+        </w:rPr>
+      </w:pPr>
+      <w:r>
+        <w:rPr>
+          <w:rFonts w:hint="default" w:ascii="Noto Sans Ethiopic" w:hAnsi="Noto Sans Ethiopic" w:cs="Noto Sans Ethiopic"/>
+          <w:sz w:val="20"/>
+          <w:szCs w:val="20"/>
+          <w:lang w:val="en-US"/>
+        </w:rPr>
+        <w:t>9.json - ቅዱስ - not found</w:t>
+      </w:r>
+    </w:p>
+    <w:p>
+      <w:pPr>
+        <w:numPr>
+          <w:numId w:val="0"/>
+        </w:numPr>
+        <w:rPr>
+          <w:rFonts w:hint="default" w:ascii="Noto Sans Ethiopic" w:hAnsi="Noto Sans Ethiopic" w:cs="Noto Sans Ethiopic"/>
+          <w:sz w:val="20"/>
+          <w:szCs w:val="20"/>
+          <w:lang w:val="en-US"/>
+        </w:rPr>
+      </w:pPr>
+      <w:r>
+        <w:rPr>
+          <w:rFonts w:hint="default" w:ascii="Noto Sans Ethiopic" w:hAnsi="Noto Sans Ethiopic" w:cs="Noto Sans Ethiopic"/>
+          <w:sz w:val="20"/>
+          <w:szCs w:val="20"/>
+          <w:lang w:val="en-US"/>
+        </w:rPr>
+        <w:t>10.json - ከዳዊት መዝሙር - not found</w:t>
+      </w:r>
+    </w:p>
+    <w:p>
+      <w:pPr>
+        <w:numPr>
+          <w:numId w:val="0"/>
+        </w:numPr>
+        <w:rPr>
+          <w:rFonts w:hint="default" w:ascii="Noto Sans Ethiopic" w:hAnsi="Noto Sans Ethiopic" w:cs="Noto Sans Ethiopic"/>
+          <w:sz w:val="20"/>
+          <w:szCs w:val="20"/>
+          <w:lang w:val="en-US"/>
+        </w:rPr>
+      </w:pPr>
+      <w:r>
+        <w:rPr>
+          <w:rFonts w:hint="default" w:ascii="Noto Sans Ethiopic" w:hAnsi="Noto Sans Ethiopic" w:cs="Noto Sans Ethiopic"/>
+          <w:sz w:val="20"/>
+          <w:szCs w:val="20"/>
+          <w:lang w:val="en-US"/>
+        </w:rPr>
+        <w:t>11.json - ይስሐቅ በኩር ልጁን - not found</w:t>
+      </w:r>
+    </w:p>
+    <w:p>
+      <w:pPr>
+        <w:numPr>
+          <w:numId w:val="0"/>
+        </w:numPr>
+        <w:rPr>
+          <w:rFonts w:hint="default" w:ascii="Noto Sans Ethiopic" w:hAnsi="Noto Sans Ethiopic" w:cs="Noto Sans Ethiopic"/>
+          <w:sz w:val="20"/>
+          <w:szCs w:val="20"/>
+          <w:lang w:val="en-US"/>
+        </w:rPr>
+      </w:pPr>
+    </w:p>
+    <w:p>
+      <w:pPr>
+        <w:numPr>
+          <w:numId w:val="0"/>
+        </w:numPr>
+        <w:rPr>
+          <w:rFonts w:hint="default" w:ascii="Noto Sans Ethiopic" w:hAnsi="Noto Sans Ethiopic" w:cs="Noto Sans Ethiopic"/>
+          <w:sz w:val="20"/>
+          <w:szCs w:val="20"/>
+          <w:lang w:val="en-US"/>
+        </w:rPr>
+      </w:pPr>
+      <w:r>
+        <w:rPr>
+          <w:rFonts w:hint="default" w:ascii="Noto Sans Ethiopic" w:hAnsi="Noto Sans Ethiopic" w:cs="Noto Sans Ethiopic"/>
+          <w:sz w:val="20"/>
+          <w:szCs w:val="20"/>
+          <w:lang w:val="en-US"/>
+        </w:rPr>
+        <w:t>ታደለ</w:t>
+      </w:r>
+    </w:p>
+    <w:p>
+      <w:pPr>
+        <w:numPr>
+          <w:numId w:val="0"/>
+        </w:numPr>
+        <w:rPr>
+          <w:rFonts w:hint="default" w:ascii="Noto Sans Ethiopic" w:hAnsi="Noto Sans Ethiopic" w:cs="Noto Sans Ethiopic"/>
+          <w:sz w:val="20"/>
+          <w:szCs w:val="20"/>
+          <w:lang w:val="en-US"/>
+        </w:rPr>
+      </w:pPr>
+      <w:r>
+        <w:rPr>
+          <w:rFonts w:hint="default" w:ascii="Noto Sans Ethiopic" w:hAnsi="Noto Sans Ethiopic" w:cs="Noto Sans Ethiopic"/>
+          <w:sz w:val="20"/>
+          <w:szCs w:val="20"/>
+          <w:lang w:val="en-US"/>
+        </w:rPr>
+        <w:t>15.json - ገዳመ ቆሮንጦስ - not found</w:t>
+      </w:r>
+    </w:p>
+    <w:p>
+      <w:pPr>
+        <w:numPr>
+          <w:numId w:val="0"/>
+        </w:numPr>
+        <w:rPr>
+          <w:rFonts w:hint="default" w:ascii="Noto Sans Ethiopic" w:hAnsi="Noto Sans Ethiopic" w:cs="Noto Sans Ethiopic"/>
+          <w:sz w:val="20"/>
+          <w:szCs w:val="20"/>
+          <w:lang w:val="en-US"/>
+        </w:rPr>
+      </w:pPr>
+      <w:r>
+        <w:rPr>
+          <w:rFonts w:hint="default" w:ascii="Noto Sans Ethiopic" w:hAnsi="Noto Sans Ethiopic" w:cs="Noto Sans Ethiopic"/>
+          <w:sz w:val="20"/>
+          <w:szCs w:val="20"/>
+          <w:lang w:val="en-US"/>
+        </w:rPr>
+        <w:t>16.json - ድንግል - not found</w:t>
+      </w:r>
+    </w:p>
+    <w:p>
+      <w:pPr>
+        <w:numPr>
+          <w:numId w:val="0"/>
+        </w:numPr>
+        <w:rPr>
+          <w:rFonts w:hint="default" w:ascii="Noto Sans Ethiopic" w:hAnsi="Noto Sans Ethiopic" w:cs="Noto Sans Ethiopic"/>
+          <w:sz w:val="20"/>
+          <w:szCs w:val="20"/>
+          <w:lang w:val="en-US"/>
+        </w:rPr>
+      </w:pPr>
+      <w:r>
+        <w:rPr>
+          <w:rFonts w:hint="default" w:ascii="Noto Sans Ethiopic" w:hAnsi="Noto Sans Ethiopic" w:cs="Noto Sans Ethiopic"/>
+          <w:sz w:val="20"/>
+          <w:szCs w:val="20"/>
+          <w:lang w:val="en-US"/>
+        </w:rPr>
+        <w:t>20.json - ለኔ ጌታ ሆኜ - not found</w:t>
+      </w:r>
+    </w:p>
+    <w:p>
+      <w:pPr>
+        <w:numPr>
+          <w:numId w:val="0"/>
+        </w:numPr>
+        <w:rPr>
+          <w:rFonts w:hint="default" w:ascii="Noto Sans Ethiopic" w:hAnsi="Noto Sans Ethiopic" w:cs="Noto Sans Ethiopic"/>
+          <w:sz w:val="20"/>
+          <w:szCs w:val="20"/>
+          <w:lang w:val="en-US"/>
+        </w:rPr>
+      </w:pPr>
+      <w:r>
+        <w:rPr>
+          <w:rFonts w:hint="default" w:ascii="Noto Sans Ethiopic" w:hAnsi="Noto Sans Ethiopic" w:cs="Noto Sans Ethiopic"/>
+          <w:sz w:val="20"/>
+          <w:szCs w:val="20"/>
+          <w:lang w:val="en-US"/>
+        </w:rPr>
+        <w:t>21.json - እኔም ላንቺ ላልሆን - not found</w:t>
+      </w:r>
+    </w:p>
+    <w:p>
+      <w:pPr>
+        <w:numPr>
+          <w:ilvl w:val="0"/>
+          <w:numId w:val="0"/>
+        </w:numPr>
+        <w:rPr>
+          <w:rFonts w:hint="default" w:ascii="Noto Sans Ethiopic" w:hAnsi="Noto Sans Ethiopic" w:cs="Noto Sans Ethiopic"/>
+          <w:sz w:val="20"/>
+          <w:szCs w:val="20"/>
+          <w:lang w:val="en-US"/>
+        </w:rPr>
+      </w:pPr>
+      <w:r>
+        <w:rPr>
+          <w:rFonts w:hint="default" w:ascii="Noto Sans Ethiopic" w:hAnsi="Noto Sans Ethiopic" w:cs="Noto Sans Ethiopic"/>
+          <w:sz w:val="20"/>
+          <w:szCs w:val="20"/>
+          <w:lang w:val="en-US"/>
+        </w:rPr>
+        <w:t>22.json - እንዴት ነህ ዝዋይ - not found</w:t>
+      </w:r>
+    </w:p>
+    <w:p>
+      <w:pPr>
+        <w:numPr>
+          <w:ilvl w:val="0"/>
+          <w:numId w:val="0"/>
+        </w:numPr>
+        <w:rPr>
+          <w:rFonts w:hint="default" w:ascii="Noto Sans Ethiopic" w:hAnsi="Noto Sans Ethiopic" w:cs="Noto Sans Ethiopic"/>
+          <w:sz w:val="20"/>
+          <w:szCs w:val="20"/>
+          <w:lang w:val="en-US"/>
+        </w:rPr>
+      </w:pPr>
+      <w:r>
+        <w:rPr>
+          <w:rFonts w:hint="default" w:ascii="Noto Sans Ethiopic" w:hAnsi="Noto Sans Ethiopic" w:cs="Noto Sans Ethiopic"/>
+          <w:sz w:val="20"/>
+          <w:szCs w:val="20"/>
+          <w:lang w:val="en-US"/>
+        </w:rPr>
+        <w:t>24.json - ሰአሊ ለነ ማርያም - not found</w:t>
+      </w:r>
+    </w:p>
+    <w:p>
+      <w:pPr>
+        <w:numPr>
+          <w:ilvl w:val="0"/>
+          <w:numId w:val="0"/>
+        </w:numPr>
+        <w:rPr>
+          <w:rFonts w:hint="default" w:ascii="Noto Sans Ethiopic" w:hAnsi="Noto Sans Ethiopic" w:cs="Noto Sans Ethiopic"/>
+          <w:sz w:val="20"/>
+          <w:szCs w:val="20"/>
+          <w:lang w:val="en-US"/>
+        </w:rPr>
+      </w:pPr>
+      <w:r>
+        <w:rPr>
+          <w:rFonts w:hint="default" w:ascii="Noto Sans Ethiopic" w:hAnsi="Noto Sans Ethiopic" w:cs="Noto Sans Ethiopic"/>
+          <w:sz w:val="20"/>
+          <w:szCs w:val="20"/>
+          <w:lang w:val="en-US"/>
+        </w:rPr>
+        <w:t>25.json - አንተ ያልከው ይሁን - not found</w:t>
+      </w:r>
+    </w:p>
+    <w:p>
+      <w:pPr>
+        <w:numPr>
+          <w:ilvl w:val="0"/>
+          <w:numId w:val="0"/>
+        </w:numPr>
+        <w:rPr>
+          <w:rFonts w:hint="default" w:ascii="Noto Sans Ethiopic" w:hAnsi="Noto Sans Ethiopic" w:cs="Noto Sans Ethiopic"/>
+          <w:sz w:val="20"/>
+          <w:szCs w:val="20"/>
+          <w:lang w:val="en-US"/>
+        </w:rPr>
+      </w:pPr>
+      <w:r>
+        <w:rPr>
+          <w:rFonts w:hint="default" w:ascii="Noto Sans Ethiopic" w:hAnsi="Noto Sans Ethiopic" w:cs="Noto Sans Ethiopic"/>
+          <w:sz w:val="20"/>
+          <w:szCs w:val="20"/>
+          <w:lang w:val="en-US"/>
+        </w:rPr>
+        <w:t>26.json - ያ ገበሬ - not found</w:t>
+      </w:r>
+    </w:p>
+    <w:p>
+      <w:pPr>
+        <w:numPr>
+          <w:ilvl w:val="0"/>
+          <w:numId w:val="0"/>
+        </w:numPr>
+        <w:rPr>
+          <w:rFonts w:hint="default" w:ascii="Noto Sans Ethiopic" w:hAnsi="Noto Sans Ethiopic" w:cs="Noto Sans Ethiopic"/>
+          <w:sz w:val="20"/>
+          <w:szCs w:val="20"/>
+          <w:lang w:val="en-US"/>
+        </w:rPr>
+      </w:pPr>
+      <w:r>
+        <w:rPr>
+          <w:rFonts w:hint="default" w:ascii="Noto Sans Ethiopic" w:hAnsi="Noto Sans Ethiopic" w:cs="Noto Sans Ethiopic"/>
+          <w:sz w:val="20"/>
+          <w:szCs w:val="20"/>
+          <w:lang w:val="en-US"/>
+        </w:rPr>
+        <w:t>27.json - ያገኘኝን አገኘሁት - not found</w:t>
+      </w:r>
+    </w:p>
+    <w:p>
+      <w:pPr>
+        <w:numPr>
+          <w:ilvl w:val="0"/>
+          <w:numId w:val="0"/>
+        </w:numPr>
+        <w:rPr>
+          <w:rFonts w:hint="default" w:ascii="Noto Sans Ethiopic" w:hAnsi="Noto Sans Ethiopic" w:cs="Noto Sans Ethiopic"/>
+          <w:sz w:val="20"/>
+          <w:szCs w:val="20"/>
+          <w:lang w:val="en-US"/>
+        </w:rPr>
+      </w:pPr>
+      <w:r>
+        <w:rPr>
+          <w:rFonts w:hint="default" w:ascii="Noto Sans Ethiopic" w:hAnsi="Noto Sans Ethiopic" w:cs="Noto Sans Ethiopic"/>
+          <w:sz w:val="20"/>
+          <w:szCs w:val="20"/>
+          <w:lang w:val="en-US"/>
+        </w:rPr>
+        <w:t>28.json - ይህ ያ ወራጅ ውኃ - not found</w:t>
+      </w:r>
+    </w:p>
+    <w:p>
+      <w:pPr>
+        <w:numPr>
+          <w:ilvl w:val="0"/>
+          <w:numId w:val="0"/>
+        </w:numPr>
+        <w:rPr>
+          <w:rFonts w:hint="default" w:ascii="Noto Sans Ethiopic" w:hAnsi="Noto Sans Ethiopic" w:cs="Noto Sans Ethiopic"/>
+          <w:sz w:val="20"/>
+          <w:szCs w:val="20"/>
+          <w:lang w:val="en-US"/>
+        </w:rPr>
+      </w:pPr>
+      <w:r>
+        <w:rPr>
+          <w:rFonts w:hint="default" w:ascii="Noto Sans Ethiopic" w:hAnsi="Noto Sans Ethiopic" w:cs="Noto Sans Ethiopic"/>
+          <w:sz w:val="20"/>
+          <w:szCs w:val="20"/>
+          <w:lang w:val="en-US"/>
+        </w:rPr>
+        <w:t>29.json - ድልድዩ አልከበደው - not found</w:t>
+      </w:r>
+    </w:p>
+    <w:p>
+      <w:pPr>
+        <w:numPr>
+          <w:ilvl w:val="0"/>
+          <w:numId w:val="0"/>
+        </w:numPr>
+        <w:rPr>
+          <w:rFonts w:hint="default" w:ascii="Noto Sans Ethiopic" w:hAnsi="Noto Sans Ethiopic" w:cs="Noto Sans Ethiopic"/>
+          <w:sz w:val="20"/>
+          <w:szCs w:val="20"/>
+          <w:lang w:val="en-US"/>
+        </w:rPr>
+      </w:pPr>
+      <w:r>
+        <w:rPr>
+          <w:rFonts w:hint="default" w:ascii="Noto Sans Ethiopic" w:hAnsi="Noto Sans Ethiopic" w:cs="Noto Sans Ethiopic"/>
+          <w:sz w:val="20"/>
+          <w:szCs w:val="20"/>
+          <w:lang w:val="en-US"/>
+        </w:rPr>
+        <w:t>30.json - ሰማሁኝ በዝና - not found</w:t>
+      </w:r>
+    </w:p>
+    <w:p>
+      <w:pPr>
+        <w:numPr>
+          <w:ilvl w:val="0"/>
+          <w:numId w:val="0"/>
+        </w:numPr>
+        <w:rPr>
+          <w:rFonts w:hint="default" w:ascii="Noto Sans Ethiopic" w:hAnsi="Noto Sans Ethiopic" w:cs="Noto Sans Ethiopic"/>
+          <w:sz w:val="20"/>
+          <w:szCs w:val="20"/>
+          <w:lang w:val="en-US"/>
+        </w:rPr>
+      </w:pPr>
+      <w:r>
+        <w:rPr>
+          <w:rFonts w:hint="default" w:ascii="Noto Sans Ethiopic" w:hAnsi="Noto Sans Ethiopic" w:cs="Noto Sans Ethiopic"/>
+          <w:sz w:val="20"/>
+          <w:szCs w:val="20"/>
+          <w:lang w:val="en-US"/>
+        </w:rPr>
+        <w:t>31.json - አምላኬ ነህ - not found</w:t>
+      </w:r>
+    </w:p>
+    <w:p>
+      <w:pPr>
+        <w:numPr>
+          <w:ilvl w:val="0"/>
+          <w:numId w:val="0"/>
+        </w:numPr>
+        <w:rPr>
+          <w:rFonts w:hint="default" w:ascii="Noto Sans Ethiopic" w:hAnsi="Noto Sans Ethiopic" w:cs="Noto Sans Ethiopic"/>
+          <w:sz w:val="20"/>
+          <w:szCs w:val="20"/>
+          <w:lang w:val="en-US"/>
+        </w:rPr>
+      </w:pPr>
+      <w:r>
+        <w:rPr>
+          <w:rFonts w:hint="default" w:ascii="Noto Sans Ethiopic" w:hAnsi="Noto Sans Ethiopic" w:cs="Noto Sans Ethiopic"/>
+          <w:sz w:val="20"/>
+          <w:szCs w:val="20"/>
+          <w:lang w:val="en-US"/>
+        </w:rPr>
+        <w:t>32.json - ያንተ ግን ይገርማል - not found</w:t>
+      </w:r>
+    </w:p>
+    <w:p>
+      <w:pPr>
+        <w:numPr>
+          <w:ilvl w:val="0"/>
+          <w:numId w:val="0"/>
+        </w:numPr>
+        <w:rPr>
+          <w:rFonts w:hint="default" w:ascii="Noto Sans Ethiopic" w:hAnsi="Noto Sans Ethiopic" w:cs="Noto Sans Ethiopic"/>
+          <w:sz w:val="20"/>
+          <w:szCs w:val="20"/>
+          <w:lang w:val="en-US"/>
+        </w:rPr>
+      </w:pPr>
+      <w:r>
+        <w:rPr>
+          <w:rFonts w:hint="default" w:ascii="Noto Sans Ethiopic" w:hAnsi="Noto Sans Ethiopic" w:cs="Noto Sans Ethiopic"/>
+          <w:sz w:val="20"/>
+          <w:szCs w:val="20"/>
+          <w:lang w:val="en-US"/>
+        </w:rPr>
+        <w:t>33.json - ቀዳማዊት ሔዋን - not found</w:t>
+      </w:r>
+    </w:p>
+    <w:p>
+      <w:pPr>
+        <w:numPr>
+          <w:ilvl w:val="0"/>
+          <w:numId w:val="0"/>
+        </w:numPr>
+        <w:rPr>
+          <w:rFonts w:hint="default" w:ascii="Noto Sans Ethiopic" w:hAnsi="Noto Sans Ethiopic" w:cs="Noto Sans Ethiopic"/>
+          <w:sz w:val="20"/>
+          <w:szCs w:val="20"/>
+          <w:lang w:val="en-US"/>
+        </w:rPr>
+      </w:pPr>
+      <w:r>
+        <w:rPr>
+          <w:rFonts w:hint="default" w:ascii="Noto Sans Ethiopic" w:hAnsi="Noto Sans Ethiopic" w:cs="Noto Sans Ethiopic"/>
+          <w:sz w:val="20"/>
+          <w:szCs w:val="20"/>
+          <w:lang w:val="en-US"/>
+        </w:rPr>
+        <w:t>34.json - በገዳዬ ምክር - not found</w:t>
+      </w:r>
+    </w:p>
+    <w:p>
+      <w:pPr>
+        <w:numPr>
+          <w:ilvl w:val="0"/>
+          <w:numId w:val="0"/>
+        </w:numPr>
+        <w:rPr>
+          <w:rFonts w:hint="default" w:ascii="Noto Sans Ethiopic" w:hAnsi="Noto Sans Ethiopic" w:cs="Noto Sans Ethiopic"/>
+          <w:sz w:val="20"/>
+          <w:szCs w:val="20"/>
+          <w:lang w:val="en-US"/>
+        </w:rPr>
+      </w:pPr>
+      <w:r>
+        <w:rPr>
+          <w:rFonts w:hint="default" w:ascii="Noto Sans Ethiopic" w:hAnsi="Noto Sans Ethiopic" w:cs="Noto Sans Ethiopic"/>
+          <w:sz w:val="20"/>
+          <w:szCs w:val="20"/>
+          <w:lang w:val="en-US"/>
+        </w:rPr>
+        <w:t>35.json - የእኛ ጌታ - not found</w:t>
+      </w:r>
+    </w:p>
+    <w:p>
+      <w:pPr>
+        <w:numPr>
+          <w:ilvl w:val="0"/>
+          <w:numId w:val="0"/>
+        </w:numPr>
+        <w:rPr>
+          <w:rFonts w:hint="default" w:ascii="Noto Sans Ethiopic" w:hAnsi="Noto Sans Ethiopic" w:cs="Noto Sans Ethiopic"/>
+          <w:sz w:val="20"/>
+          <w:szCs w:val="20"/>
+          <w:lang w:val="en-US"/>
+        </w:rPr>
+      </w:pPr>
+      <w:r>
+        <w:rPr>
+          <w:rFonts w:hint="default" w:ascii="Noto Sans Ethiopic" w:hAnsi="Noto Sans Ethiopic" w:cs="Noto Sans Ethiopic"/>
+          <w:sz w:val="20"/>
+          <w:szCs w:val="20"/>
+          <w:lang w:val="en-US"/>
+        </w:rPr>
+        <w:t>36.json - በዛ የብሶ - not found</w:t>
+      </w:r>
+    </w:p>
+    <w:p>
+      <w:pPr>
+        <w:numPr>
+          <w:ilvl w:val="0"/>
+          <w:numId w:val="0"/>
+        </w:numPr>
+        <w:rPr>
+          <w:rFonts w:hint="default" w:ascii="Noto Sans Ethiopic" w:hAnsi="Noto Sans Ethiopic" w:cs="Noto Sans Ethiopic"/>
+          <w:sz w:val="20"/>
+          <w:szCs w:val="20"/>
+          <w:lang w:val="en-US"/>
+        </w:rPr>
+      </w:pPr>
+      <w:r>
+        <w:rPr>
+          <w:rFonts w:hint="default" w:ascii="Noto Sans Ethiopic" w:hAnsi="Noto Sans Ethiopic" w:cs="Noto Sans Ethiopic"/>
+          <w:sz w:val="20"/>
+          <w:szCs w:val="20"/>
+          <w:lang w:val="en-US"/>
+        </w:rPr>
+        <w:t>37.json - ባሕር ብሻገርም - not found</w:t>
+      </w:r>
+    </w:p>
+    <w:p>
+      <w:pPr>
+        <w:numPr>
+          <w:ilvl w:val="0"/>
+          <w:numId w:val="0"/>
+        </w:numPr>
+        <w:rPr>
+          <w:rFonts w:hint="default" w:ascii="Noto Sans Ethiopic" w:hAnsi="Noto Sans Ethiopic" w:cs="Noto Sans Ethiopic"/>
+          <w:sz w:val="20"/>
+          <w:szCs w:val="20"/>
+          <w:lang w:val="en-US"/>
+        </w:rPr>
+      </w:pPr>
+      <w:r>
+        <w:rPr>
+          <w:rFonts w:hint="default" w:ascii="Noto Sans Ethiopic" w:hAnsi="Noto Sans Ethiopic" w:cs="Noto Sans Ethiopic"/>
+          <w:sz w:val="20"/>
+          <w:szCs w:val="20"/>
+          <w:lang w:val="en-US"/>
+        </w:rPr>
+        <w:t>38.json - ባሕር ብሻገርም2 - not found</w:t>
+      </w:r>
+    </w:p>
+    <w:p>
+      <w:pPr>
+        <w:numPr>
+          <w:numId w:val="0"/>
+        </w:numPr>
+        <w:rPr>
+          <w:rFonts w:hint="default" w:ascii="Noto Sans Ethiopic" w:hAnsi="Noto Sans Ethiopic" w:cs="Noto Sans Ethiopic"/>
+          <w:sz w:val="20"/>
+          <w:szCs w:val="20"/>
           <w:lang w:val="en-US"/>
         </w:rPr>
       </w:pPr>
@@ -2146,8 +3047,27 @@
       <w:lvlJc w:val="left"/>
     </w:lvl>
   </w:abstractNum>
+  <w:abstractNum w:abstractNumId="1">
+    <w:nsid w:val="6BBA86D6"/>
+    <w:multiLevelType w:val="singleLevel"/>
+    <w:tmpl w:val="6BBA86D6"/>
+    <w:lvl w:ilvl="0" w:tentative="0">
+      <w:start w:val="19"/>
+      <w:numFmt w:val="decimal"/>
+      <w:lvlText w:val="%1."/>
+      <w:lvlJc w:val="left"/>
+      <w:pPr>
+        <w:tabs>
+          <w:tab w:val="left" w:pos="312"/>
+        </w:tabs>
+      </w:pPr>
+    </w:lvl>
+  </w:abstractNum>
   <w:num w:numId="1">
     <w:abstractNumId w:val="0"/>
+  </w:num>
+  <w:num w:numId="2">
+    <w:abstractNumId w:val="1"/>
   </w:num>
 </w:numbering>
 </file>

</xml_diff>

<commit_message>
all except alemayehu done
</commit_message>
<xml_diff>
--- a/lost mezmurs.docx
+++ b/lost mezmurs.docx
@@ -2185,15 +2185,7 @@
           <w:szCs w:val="22"/>
           <w:lang w:val="en-US"/>
         </w:rPr>
-        <w:t xml:space="preserve">2.json - </w:t>
-      </w:r>
-      <w:r>
-        <w:rPr>
-          <w:rFonts w:hint="default" w:ascii="Noto Sans Ethiopic" w:hAnsi="Noto Sans Ethiopic" w:cs="Noto Sans Ethiopic"/>
-          <w:sz w:val="20"/>
-          <w:szCs w:val="20"/>
-        </w:rPr>
-        <w:t>አንተ አይደለህም ወይ</w:t>
+        <w:t>2.json - ዋኔን</w:t>
       </w:r>
       <w:r>
         <w:rPr>
@@ -2550,557 +2542,557 @@
           <w:lang w:val="en-US"/>
         </w:rPr>
         <w:t>ታደለ</w:t>
-      </w:r>
-    </w:p>
-    <w:p>
-      <w:pPr>
-        <w:numPr>
-          <w:numId w:val="0"/>
-        </w:numPr>
-        <w:rPr>
-          <w:rFonts w:hint="default" w:ascii="Noto Sans Ethiopic" w:hAnsi="Noto Sans Ethiopic" w:cs="Noto Sans Ethiopic"/>
-          <w:sz w:val="20"/>
-          <w:szCs w:val="20"/>
-          <w:lang w:val="en-US"/>
-        </w:rPr>
-      </w:pPr>
-      <w:r>
-        <w:rPr>
-          <w:rFonts w:hint="default" w:ascii="Noto Sans Ethiopic" w:hAnsi="Noto Sans Ethiopic" w:cs="Noto Sans Ethiopic"/>
-          <w:sz w:val="20"/>
-          <w:szCs w:val="20"/>
-          <w:lang w:val="en-US"/>
-        </w:rPr>
-        <w:t>15.json - ገዳመ ቆሮንጦስ - not found</w:t>
-      </w:r>
-    </w:p>
-    <w:p>
-      <w:pPr>
-        <w:numPr>
-          <w:numId w:val="0"/>
-        </w:numPr>
-        <w:rPr>
-          <w:rFonts w:hint="default" w:ascii="Noto Sans Ethiopic" w:hAnsi="Noto Sans Ethiopic" w:cs="Noto Sans Ethiopic"/>
-          <w:sz w:val="20"/>
-          <w:szCs w:val="20"/>
-          <w:lang w:val="en-US"/>
-        </w:rPr>
-      </w:pPr>
-      <w:r>
-        <w:rPr>
-          <w:rFonts w:hint="default" w:ascii="Noto Sans Ethiopic" w:hAnsi="Noto Sans Ethiopic" w:cs="Noto Sans Ethiopic"/>
-          <w:sz w:val="20"/>
-          <w:szCs w:val="20"/>
-          <w:lang w:val="en-US"/>
-        </w:rPr>
-        <w:t>16.json - ድንግል - not found</w:t>
-      </w:r>
-    </w:p>
-    <w:p>
-      <w:pPr>
-        <w:numPr>
-          <w:numId w:val="0"/>
-        </w:numPr>
-        <w:rPr>
-          <w:rFonts w:hint="default" w:ascii="Noto Sans Ethiopic" w:hAnsi="Noto Sans Ethiopic" w:cs="Noto Sans Ethiopic"/>
-          <w:sz w:val="20"/>
-          <w:szCs w:val="20"/>
-          <w:lang w:val="en-US"/>
-        </w:rPr>
-      </w:pPr>
-      <w:r>
-        <w:rPr>
-          <w:rFonts w:hint="default" w:ascii="Noto Sans Ethiopic" w:hAnsi="Noto Sans Ethiopic" w:cs="Noto Sans Ethiopic"/>
-          <w:sz w:val="20"/>
-          <w:szCs w:val="20"/>
-          <w:lang w:val="en-US"/>
-        </w:rPr>
-        <w:t>20.json - ለኔ ጌታ ሆኜ - not found</w:t>
-      </w:r>
-    </w:p>
-    <w:p>
-      <w:pPr>
-        <w:numPr>
-          <w:numId w:val="0"/>
-        </w:numPr>
-        <w:rPr>
-          <w:rFonts w:hint="default" w:ascii="Noto Sans Ethiopic" w:hAnsi="Noto Sans Ethiopic" w:cs="Noto Sans Ethiopic"/>
-          <w:sz w:val="20"/>
-          <w:szCs w:val="20"/>
-          <w:lang w:val="en-US"/>
-        </w:rPr>
-      </w:pPr>
-      <w:r>
-        <w:rPr>
-          <w:rFonts w:hint="default" w:ascii="Noto Sans Ethiopic" w:hAnsi="Noto Sans Ethiopic" w:cs="Noto Sans Ethiopic"/>
-          <w:sz w:val="20"/>
-          <w:szCs w:val="20"/>
-          <w:lang w:val="en-US"/>
-        </w:rPr>
-        <w:t>21.json - እኔም ላንቺ ላልሆን - not found</w:t>
-      </w:r>
-    </w:p>
-    <w:p>
-      <w:pPr>
-        <w:numPr>
-          <w:ilvl w:val="0"/>
-          <w:numId w:val="0"/>
-        </w:numPr>
-        <w:rPr>
-          <w:rFonts w:hint="default" w:ascii="Noto Sans Ethiopic" w:hAnsi="Noto Sans Ethiopic" w:cs="Noto Sans Ethiopic"/>
-          <w:sz w:val="20"/>
-          <w:szCs w:val="20"/>
-          <w:lang w:val="en-US"/>
-        </w:rPr>
-      </w:pPr>
-      <w:r>
-        <w:rPr>
-          <w:rFonts w:hint="default" w:ascii="Noto Sans Ethiopic" w:hAnsi="Noto Sans Ethiopic" w:cs="Noto Sans Ethiopic"/>
-          <w:sz w:val="20"/>
-          <w:szCs w:val="20"/>
-          <w:lang w:val="en-US"/>
-        </w:rPr>
-        <w:t>22.json - እንዴት ነህ ዝዋይ - not found</w:t>
-      </w:r>
-    </w:p>
-    <w:p>
-      <w:pPr>
-        <w:numPr>
-          <w:ilvl w:val="0"/>
-          <w:numId w:val="0"/>
-        </w:numPr>
-        <w:rPr>
-          <w:rFonts w:hint="default" w:ascii="Noto Sans Ethiopic" w:hAnsi="Noto Sans Ethiopic" w:cs="Noto Sans Ethiopic"/>
-          <w:sz w:val="20"/>
-          <w:szCs w:val="20"/>
-          <w:lang w:val="en-US"/>
-        </w:rPr>
-      </w:pPr>
-      <w:r>
-        <w:rPr>
-          <w:rFonts w:hint="default" w:ascii="Noto Sans Ethiopic" w:hAnsi="Noto Sans Ethiopic" w:cs="Noto Sans Ethiopic"/>
-          <w:sz w:val="20"/>
-          <w:szCs w:val="20"/>
-          <w:lang w:val="en-US"/>
-        </w:rPr>
-        <w:t>24.json - ሰአሊ ለነ ማርያም - not found</w:t>
-      </w:r>
-    </w:p>
-    <w:p>
-      <w:pPr>
-        <w:numPr>
-          <w:ilvl w:val="0"/>
-          <w:numId w:val="0"/>
-        </w:numPr>
-        <w:rPr>
-          <w:rFonts w:hint="default" w:ascii="Noto Sans Ethiopic" w:hAnsi="Noto Sans Ethiopic" w:cs="Noto Sans Ethiopic"/>
-          <w:sz w:val="20"/>
-          <w:szCs w:val="20"/>
-          <w:lang w:val="en-US"/>
-        </w:rPr>
-      </w:pPr>
-      <w:r>
-        <w:rPr>
-          <w:rFonts w:hint="default" w:ascii="Noto Sans Ethiopic" w:hAnsi="Noto Sans Ethiopic" w:cs="Noto Sans Ethiopic"/>
-          <w:sz w:val="20"/>
-          <w:szCs w:val="20"/>
-          <w:lang w:val="en-US"/>
-        </w:rPr>
-        <w:t>25.json - አንተ ያልከው ይሁን - not found</w:t>
-      </w:r>
-    </w:p>
-    <w:p>
-      <w:pPr>
-        <w:numPr>
-          <w:ilvl w:val="0"/>
-          <w:numId w:val="0"/>
-        </w:numPr>
-        <w:rPr>
-          <w:rFonts w:hint="default" w:ascii="Noto Sans Ethiopic" w:hAnsi="Noto Sans Ethiopic" w:cs="Noto Sans Ethiopic"/>
-          <w:sz w:val="20"/>
-          <w:szCs w:val="20"/>
-          <w:lang w:val="en-US"/>
-        </w:rPr>
-      </w:pPr>
-      <w:r>
-        <w:rPr>
-          <w:rFonts w:hint="default" w:ascii="Noto Sans Ethiopic" w:hAnsi="Noto Sans Ethiopic" w:cs="Noto Sans Ethiopic"/>
-          <w:sz w:val="20"/>
-          <w:szCs w:val="20"/>
-          <w:lang w:val="en-US"/>
-        </w:rPr>
-        <w:t>26.json - ያ ገበሬ - not found</w:t>
-      </w:r>
-    </w:p>
-    <w:p>
-      <w:pPr>
-        <w:numPr>
-          <w:ilvl w:val="0"/>
-          <w:numId w:val="0"/>
-        </w:numPr>
-        <w:rPr>
-          <w:rFonts w:hint="default" w:ascii="Noto Sans Ethiopic" w:hAnsi="Noto Sans Ethiopic" w:cs="Noto Sans Ethiopic"/>
-          <w:sz w:val="20"/>
-          <w:szCs w:val="20"/>
-          <w:lang w:val="en-US"/>
-        </w:rPr>
-      </w:pPr>
-      <w:r>
-        <w:rPr>
-          <w:rFonts w:hint="default" w:ascii="Noto Sans Ethiopic" w:hAnsi="Noto Sans Ethiopic" w:cs="Noto Sans Ethiopic"/>
-          <w:sz w:val="20"/>
-          <w:szCs w:val="20"/>
-          <w:lang w:val="en-US"/>
-        </w:rPr>
-        <w:t>27.json - ያገኘኝን አገኘሁት - not found</w:t>
-      </w:r>
-    </w:p>
-    <w:p>
-      <w:pPr>
-        <w:numPr>
-          <w:ilvl w:val="0"/>
-          <w:numId w:val="0"/>
-        </w:numPr>
-        <w:rPr>
-          <w:rFonts w:hint="default" w:ascii="Noto Sans Ethiopic" w:hAnsi="Noto Sans Ethiopic" w:cs="Noto Sans Ethiopic"/>
-          <w:sz w:val="20"/>
-          <w:szCs w:val="20"/>
-          <w:lang w:val="en-US"/>
-        </w:rPr>
-      </w:pPr>
-      <w:r>
-        <w:rPr>
-          <w:rFonts w:hint="default" w:ascii="Noto Sans Ethiopic" w:hAnsi="Noto Sans Ethiopic" w:cs="Noto Sans Ethiopic"/>
-          <w:sz w:val="20"/>
-          <w:szCs w:val="20"/>
-          <w:lang w:val="en-US"/>
-        </w:rPr>
-        <w:t>28.json - ይህ ያ ወራጅ ውኃ - not found</w:t>
-      </w:r>
-    </w:p>
-    <w:p>
-      <w:pPr>
-        <w:numPr>
-          <w:ilvl w:val="0"/>
-          <w:numId w:val="0"/>
-        </w:numPr>
-        <w:rPr>
-          <w:rFonts w:hint="default" w:ascii="Noto Sans Ethiopic" w:hAnsi="Noto Sans Ethiopic" w:cs="Noto Sans Ethiopic"/>
-          <w:sz w:val="20"/>
-          <w:szCs w:val="20"/>
-          <w:lang w:val="en-US"/>
-        </w:rPr>
-      </w:pPr>
-      <w:r>
-        <w:rPr>
-          <w:rFonts w:hint="default" w:ascii="Noto Sans Ethiopic" w:hAnsi="Noto Sans Ethiopic" w:cs="Noto Sans Ethiopic"/>
-          <w:sz w:val="20"/>
-          <w:szCs w:val="20"/>
-          <w:lang w:val="en-US"/>
-        </w:rPr>
-        <w:t>29.json - ድልድዩ አልከበደው - not found</w:t>
-      </w:r>
-    </w:p>
-    <w:p>
-      <w:pPr>
-        <w:numPr>
-          <w:ilvl w:val="0"/>
-          <w:numId w:val="0"/>
-        </w:numPr>
-        <w:rPr>
-          <w:rFonts w:hint="default" w:ascii="Noto Sans Ethiopic" w:hAnsi="Noto Sans Ethiopic" w:cs="Noto Sans Ethiopic"/>
-          <w:sz w:val="20"/>
-          <w:szCs w:val="20"/>
-          <w:lang w:val="en-US"/>
-        </w:rPr>
-      </w:pPr>
-      <w:r>
-        <w:rPr>
-          <w:rFonts w:hint="default" w:ascii="Noto Sans Ethiopic" w:hAnsi="Noto Sans Ethiopic" w:cs="Noto Sans Ethiopic"/>
-          <w:sz w:val="20"/>
-          <w:szCs w:val="20"/>
-          <w:lang w:val="en-US"/>
-        </w:rPr>
-        <w:t>30.json - ሰማሁኝ በዝና - not found</w:t>
-      </w:r>
-    </w:p>
-    <w:p>
-      <w:pPr>
-        <w:numPr>
-          <w:ilvl w:val="0"/>
-          <w:numId w:val="0"/>
-        </w:numPr>
-        <w:rPr>
-          <w:rFonts w:hint="default" w:ascii="Noto Sans Ethiopic" w:hAnsi="Noto Sans Ethiopic" w:cs="Noto Sans Ethiopic"/>
-          <w:sz w:val="20"/>
-          <w:szCs w:val="20"/>
-          <w:lang w:val="en-US"/>
-        </w:rPr>
-      </w:pPr>
-      <w:r>
-        <w:rPr>
-          <w:rFonts w:hint="default" w:ascii="Noto Sans Ethiopic" w:hAnsi="Noto Sans Ethiopic" w:cs="Noto Sans Ethiopic"/>
-          <w:sz w:val="20"/>
-          <w:szCs w:val="20"/>
-          <w:lang w:val="en-US"/>
-        </w:rPr>
-        <w:t>31.json - አምላኬ ነህ - not found</w:t>
-      </w:r>
-    </w:p>
-    <w:p>
-      <w:pPr>
-        <w:numPr>
-          <w:ilvl w:val="0"/>
-          <w:numId w:val="0"/>
-        </w:numPr>
-        <w:rPr>
-          <w:rFonts w:hint="default" w:ascii="Noto Sans Ethiopic" w:hAnsi="Noto Sans Ethiopic" w:cs="Noto Sans Ethiopic"/>
-          <w:sz w:val="20"/>
-          <w:szCs w:val="20"/>
-          <w:lang w:val="en-US"/>
-        </w:rPr>
-      </w:pPr>
-      <w:r>
-        <w:rPr>
-          <w:rFonts w:hint="default" w:ascii="Noto Sans Ethiopic" w:hAnsi="Noto Sans Ethiopic" w:cs="Noto Sans Ethiopic"/>
-          <w:sz w:val="20"/>
-          <w:szCs w:val="20"/>
-          <w:lang w:val="en-US"/>
-        </w:rPr>
-        <w:t>32.json - ያንተ ግን ይገርማል - not found</w:t>
-      </w:r>
-    </w:p>
-    <w:p>
-      <w:pPr>
-        <w:numPr>
-          <w:ilvl w:val="0"/>
-          <w:numId w:val="0"/>
-        </w:numPr>
-        <w:rPr>
-          <w:rFonts w:hint="default" w:ascii="Noto Sans Ethiopic" w:hAnsi="Noto Sans Ethiopic" w:cs="Noto Sans Ethiopic"/>
-          <w:sz w:val="20"/>
-          <w:szCs w:val="20"/>
-          <w:lang w:val="en-US"/>
-        </w:rPr>
-      </w:pPr>
-      <w:r>
-        <w:rPr>
-          <w:rFonts w:hint="default" w:ascii="Noto Sans Ethiopic" w:hAnsi="Noto Sans Ethiopic" w:cs="Noto Sans Ethiopic"/>
-          <w:sz w:val="20"/>
-          <w:szCs w:val="20"/>
-          <w:lang w:val="en-US"/>
-        </w:rPr>
-        <w:t>33.json - ቀዳማዊት ሔዋን - not found</w:t>
-      </w:r>
-    </w:p>
-    <w:p>
-      <w:pPr>
-        <w:numPr>
-          <w:ilvl w:val="0"/>
-          <w:numId w:val="0"/>
-        </w:numPr>
-        <w:rPr>
-          <w:rFonts w:hint="default" w:ascii="Noto Sans Ethiopic" w:hAnsi="Noto Sans Ethiopic" w:cs="Noto Sans Ethiopic"/>
-          <w:sz w:val="20"/>
-          <w:szCs w:val="20"/>
-          <w:lang w:val="en-US"/>
-        </w:rPr>
-      </w:pPr>
-      <w:r>
-        <w:rPr>
-          <w:rFonts w:hint="default" w:ascii="Noto Sans Ethiopic" w:hAnsi="Noto Sans Ethiopic" w:cs="Noto Sans Ethiopic"/>
-          <w:sz w:val="20"/>
-          <w:szCs w:val="20"/>
-          <w:lang w:val="en-US"/>
-        </w:rPr>
-        <w:t>34.json - በገዳዬ ምክር - not found</w:t>
-      </w:r>
-    </w:p>
-    <w:p>
-      <w:pPr>
-        <w:numPr>
-          <w:ilvl w:val="0"/>
-          <w:numId w:val="0"/>
-        </w:numPr>
-        <w:rPr>
-          <w:rFonts w:hint="default" w:ascii="Noto Sans Ethiopic" w:hAnsi="Noto Sans Ethiopic" w:cs="Noto Sans Ethiopic"/>
-          <w:sz w:val="20"/>
-          <w:szCs w:val="20"/>
-          <w:lang w:val="en-US"/>
-        </w:rPr>
-      </w:pPr>
-      <w:r>
-        <w:rPr>
-          <w:rFonts w:hint="default" w:ascii="Noto Sans Ethiopic" w:hAnsi="Noto Sans Ethiopic" w:cs="Noto Sans Ethiopic"/>
-          <w:sz w:val="20"/>
-          <w:szCs w:val="20"/>
-          <w:lang w:val="en-US"/>
-        </w:rPr>
-        <w:t>35.json - የእኛ ጌታ - not found</w:t>
-      </w:r>
-    </w:p>
-    <w:p>
-      <w:pPr>
-        <w:numPr>
-          <w:ilvl w:val="0"/>
-          <w:numId w:val="0"/>
-        </w:numPr>
-        <w:rPr>
-          <w:rFonts w:hint="default" w:ascii="Noto Sans Ethiopic" w:hAnsi="Noto Sans Ethiopic" w:cs="Noto Sans Ethiopic"/>
-          <w:sz w:val="20"/>
-          <w:szCs w:val="20"/>
-          <w:lang w:val="en-US"/>
-        </w:rPr>
-      </w:pPr>
-      <w:r>
-        <w:rPr>
-          <w:rFonts w:hint="default" w:ascii="Noto Sans Ethiopic" w:hAnsi="Noto Sans Ethiopic" w:cs="Noto Sans Ethiopic"/>
-          <w:sz w:val="20"/>
-          <w:szCs w:val="20"/>
-          <w:lang w:val="en-US"/>
-        </w:rPr>
-        <w:t>36.json - በዛ የብሶ - not found</w:t>
-      </w:r>
-    </w:p>
-    <w:p>
-      <w:pPr>
-        <w:numPr>
-          <w:ilvl w:val="0"/>
-          <w:numId w:val="0"/>
-        </w:numPr>
-        <w:rPr>
-          <w:rFonts w:hint="default" w:ascii="Noto Sans Ethiopic" w:hAnsi="Noto Sans Ethiopic" w:cs="Noto Sans Ethiopic"/>
-          <w:sz w:val="20"/>
-          <w:szCs w:val="20"/>
-          <w:lang w:val="en-US"/>
-        </w:rPr>
-      </w:pPr>
-      <w:r>
-        <w:rPr>
-          <w:rFonts w:hint="default" w:ascii="Noto Sans Ethiopic" w:hAnsi="Noto Sans Ethiopic" w:cs="Noto Sans Ethiopic"/>
-          <w:sz w:val="20"/>
-          <w:szCs w:val="20"/>
-          <w:lang w:val="en-US"/>
-        </w:rPr>
-        <w:t>37.json - ባሕር ብሻገርም - not found</w:t>
-      </w:r>
-    </w:p>
-    <w:p>
-      <w:pPr>
-        <w:numPr>
-          <w:ilvl w:val="0"/>
-          <w:numId w:val="0"/>
-        </w:numPr>
-        <w:rPr>
-          <w:rFonts w:hint="default" w:ascii="Noto Sans Ethiopic" w:hAnsi="Noto Sans Ethiopic" w:cs="Noto Sans Ethiopic"/>
-          <w:sz w:val="20"/>
-          <w:szCs w:val="20"/>
-          <w:lang w:val="en-US"/>
-        </w:rPr>
-      </w:pPr>
-      <w:r>
-        <w:rPr>
-          <w:rFonts w:hint="default" w:ascii="Noto Sans Ethiopic" w:hAnsi="Noto Sans Ethiopic" w:cs="Noto Sans Ethiopic"/>
-          <w:sz w:val="20"/>
-          <w:szCs w:val="20"/>
-          <w:lang w:val="en-US"/>
-        </w:rPr>
-        <w:t>38.json - ባሕር ብሻገርም2 - not found</w:t>
-      </w:r>
-    </w:p>
-    <w:p>
-      <w:pPr>
-        <w:numPr>
-          <w:numId w:val="0"/>
-        </w:numPr>
-        <w:rPr>
-          <w:rFonts w:hint="default" w:ascii="Noto Sans Ethiopic" w:hAnsi="Noto Sans Ethiopic" w:cs="Noto Sans Ethiopic"/>
-          <w:sz w:val="20"/>
-          <w:szCs w:val="20"/>
-          <w:lang w:val="en-US"/>
-        </w:rPr>
-      </w:pPr>
-    </w:p>
-    <w:p>
-      <w:pPr>
-        <w:numPr>
-          <w:numId w:val="0"/>
-        </w:numPr>
-        <w:rPr>
-          <w:rFonts w:hint="default" w:ascii="Noto Sans Ethiopic" w:hAnsi="Noto Sans Ethiopic" w:cs="Noto Sans Ethiopic"/>
-          <w:sz w:val="20"/>
-          <w:szCs w:val="20"/>
-          <w:lang w:val="en-US"/>
-        </w:rPr>
-      </w:pPr>
-    </w:p>
-    <w:p>
-      <w:pPr>
-        <w:numPr>
-          <w:numId w:val="0"/>
-        </w:numPr>
-        <w:rPr>
-          <w:rFonts w:hint="default" w:ascii="Noto Sans Ethiopic" w:hAnsi="Noto Sans Ethiopic" w:cs="Noto Sans Ethiopic"/>
-          <w:sz w:val="20"/>
-          <w:szCs w:val="20"/>
-          <w:lang w:val="en-US"/>
-        </w:rPr>
-      </w:pPr>
-      <w:r>
-        <w:rPr>
-          <w:rFonts w:hint="default" w:ascii="Noto Sans Ethiopic" w:hAnsi="Noto Sans Ethiopic" w:cs="Noto Sans Ethiopic"/>
-          <w:sz w:val="20"/>
-          <w:szCs w:val="20"/>
-          <w:lang w:val="en-US"/>
-        </w:rPr>
-        <w:t>ዘርፉ</w:t>
-      </w:r>
-    </w:p>
-    <w:p>
-      <w:pPr>
-        <w:numPr>
-          <w:numId w:val="0"/>
-        </w:numPr>
-        <w:rPr>
-          <w:rFonts w:hint="default" w:ascii="Noto Sans Ethiopic" w:hAnsi="Noto Sans Ethiopic" w:cs="Noto Sans Ethiopic"/>
-          <w:sz w:val="20"/>
-          <w:szCs w:val="20"/>
-          <w:lang w:val="en-US"/>
-        </w:rPr>
-      </w:pPr>
-      <w:r>
-        <w:rPr>
-          <w:rFonts w:hint="default" w:ascii="Noto Sans Ethiopic" w:hAnsi="Noto Sans Ethiopic" w:cs="Noto Sans Ethiopic"/>
-          <w:sz w:val="20"/>
-          <w:szCs w:val="20"/>
-          <w:lang w:val="en-US"/>
-        </w:rPr>
-        <w:t>8.json - የእመቤታችን ምስጋና</w:t>
-      </w:r>
-    </w:p>
-    <w:p>
-      <w:pPr>
-        <w:numPr>
-          <w:numId w:val="0"/>
-        </w:numPr>
-        <w:rPr>
-          <w:rFonts w:hint="default" w:ascii="Noto Sans Ethiopic" w:hAnsi="Noto Sans Ethiopic" w:cs="Noto Sans Ethiopic"/>
-          <w:sz w:val="20"/>
-          <w:szCs w:val="20"/>
-          <w:lang w:val="en-US"/>
-        </w:rPr>
-      </w:pPr>
-      <w:r>
-        <w:rPr>
-          <w:rFonts w:hint="default" w:ascii="Noto Sans Ethiopic" w:hAnsi="Noto Sans Ethiopic" w:cs="Noto Sans Ethiopic"/>
-          <w:sz w:val="20"/>
-          <w:szCs w:val="20"/>
-          <w:lang w:val="en-US"/>
-        </w:rPr>
-        <w:t>9. teweledeln - may need some edit on the gtm</w:t>
       </w:r>
       <w:bookmarkStart w:id="0" w:name="_GoBack"/>
       <w:bookmarkEnd w:id="0"/>
+    </w:p>
+    <w:p>
+      <w:pPr>
+        <w:numPr>
+          <w:numId w:val="0"/>
+        </w:numPr>
+        <w:rPr>
+          <w:rFonts w:hint="default" w:ascii="Noto Sans Ethiopic" w:hAnsi="Noto Sans Ethiopic" w:cs="Noto Sans Ethiopic"/>
+          <w:sz w:val="20"/>
+          <w:szCs w:val="20"/>
+          <w:lang w:val="en-US"/>
+        </w:rPr>
+      </w:pPr>
+      <w:r>
+        <w:rPr>
+          <w:rFonts w:hint="default" w:ascii="Noto Sans Ethiopic" w:hAnsi="Noto Sans Ethiopic" w:cs="Noto Sans Ethiopic"/>
+          <w:sz w:val="20"/>
+          <w:szCs w:val="20"/>
+          <w:lang w:val="en-US"/>
+        </w:rPr>
+        <w:t>15.json - ገዳመ ቆሮንጦስ - not found</w:t>
+      </w:r>
+    </w:p>
+    <w:p>
+      <w:pPr>
+        <w:numPr>
+          <w:numId w:val="0"/>
+        </w:numPr>
+        <w:rPr>
+          <w:rFonts w:hint="default" w:ascii="Noto Sans Ethiopic" w:hAnsi="Noto Sans Ethiopic" w:cs="Noto Sans Ethiopic"/>
+          <w:sz w:val="20"/>
+          <w:szCs w:val="20"/>
+          <w:lang w:val="en-US"/>
+        </w:rPr>
+      </w:pPr>
+      <w:r>
+        <w:rPr>
+          <w:rFonts w:hint="default" w:ascii="Noto Sans Ethiopic" w:hAnsi="Noto Sans Ethiopic" w:cs="Noto Sans Ethiopic"/>
+          <w:sz w:val="20"/>
+          <w:szCs w:val="20"/>
+          <w:lang w:val="en-US"/>
+        </w:rPr>
+        <w:t>16.json - ድንግል - not found</w:t>
+      </w:r>
+    </w:p>
+    <w:p>
+      <w:pPr>
+        <w:numPr>
+          <w:numId w:val="0"/>
+        </w:numPr>
+        <w:rPr>
+          <w:rFonts w:hint="default" w:ascii="Noto Sans Ethiopic" w:hAnsi="Noto Sans Ethiopic" w:cs="Noto Sans Ethiopic"/>
+          <w:sz w:val="20"/>
+          <w:szCs w:val="20"/>
+          <w:lang w:val="en-US"/>
+        </w:rPr>
+      </w:pPr>
+      <w:r>
+        <w:rPr>
+          <w:rFonts w:hint="default" w:ascii="Noto Sans Ethiopic" w:hAnsi="Noto Sans Ethiopic" w:cs="Noto Sans Ethiopic"/>
+          <w:sz w:val="20"/>
+          <w:szCs w:val="20"/>
+          <w:lang w:val="en-US"/>
+        </w:rPr>
+        <w:t>20.json - ለኔ ጌታ ሆኜ - not found</w:t>
+      </w:r>
+    </w:p>
+    <w:p>
+      <w:pPr>
+        <w:numPr>
+          <w:numId w:val="0"/>
+        </w:numPr>
+        <w:rPr>
+          <w:rFonts w:hint="default" w:ascii="Noto Sans Ethiopic" w:hAnsi="Noto Sans Ethiopic" w:cs="Noto Sans Ethiopic"/>
+          <w:sz w:val="20"/>
+          <w:szCs w:val="20"/>
+          <w:lang w:val="en-US"/>
+        </w:rPr>
+      </w:pPr>
+      <w:r>
+        <w:rPr>
+          <w:rFonts w:hint="default" w:ascii="Noto Sans Ethiopic" w:hAnsi="Noto Sans Ethiopic" w:cs="Noto Sans Ethiopic"/>
+          <w:sz w:val="20"/>
+          <w:szCs w:val="20"/>
+          <w:lang w:val="en-US"/>
+        </w:rPr>
+        <w:t>21.json - እኔም ላንቺ ላልሆን - not found</w:t>
+      </w:r>
+    </w:p>
+    <w:p>
+      <w:pPr>
+        <w:numPr>
+          <w:ilvl w:val="0"/>
+          <w:numId w:val="0"/>
+        </w:numPr>
+        <w:rPr>
+          <w:rFonts w:hint="default" w:ascii="Noto Sans Ethiopic" w:hAnsi="Noto Sans Ethiopic" w:cs="Noto Sans Ethiopic"/>
+          <w:sz w:val="20"/>
+          <w:szCs w:val="20"/>
+          <w:lang w:val="en-US"/>
+        </w:rPr>
+      </w:pPr>
+      <w:r>
+        <w:rPr>
+          <w:rFonts w:hint="default" w:ascii="Noto Sans Ethiopic" w:hAnsi="Noto Sans Ethiopic" w:cs="Noto Sans Ethiopic"/>
+          <w:sz w:val="20"/>
+          <w:szCs w:val="20"/>
+          <w:lang w:val="en-US"/>
+        </w:rPr>
+        <w:t>22.json - እንዴት ነህ ዝዋይ - not found</w:t>
+      </w:r>
+    </w:p>
+    <w:p>
+      <w:pPr>
+        <w:numPr>
+          <w:ilvl w:val="0"/>
+          <w:numId w:val="0"/>
+        </w:numPr>
+        <w:rPr>
+          <w:rFonts w:hint="default" w:ascii="Noto Sans Ethiopic" w:hAnsi="Noto Sans Ethiopic" w:cs="Noto Sans Ethiopic"/>
+          <w:sz w:val="20"/>
+          <w:szCs w:val="20"/>
+          <w:lang w:val="en-US"/>
+        </w:rPr>
+      </w:pPr>
+      <w:r>
+        <w:rPr>
+          <w:rFonts w:hint="default" w:ascii="Noto Sans Ethiopic" w:hAnsi="Noto Sans Ethiopic" w:cs="Noto Sans Ethiopic"/>
+          <w:sz w:val="20"/>
+          <w:szCs w:val="20"/>
+          <w:lang w:val="en-US"/>
+        </w:rPr>
+        <w:t>24.json - ሰአሊ ለነ ማርያም - not found</w:t>
+      </w:r>
+    </w:p>
+    <w:p>
+      <w:pPr>
+        <w:numPr>
+          <w:ilvl w:val="0"/>
+          <w:numId w:val="0"/>
+        </w:numPr>
+        <w:rPr>
+          <w:rFonts w:hint="default" w:ascii="Noto Sans Ethiopic" w:hAnsi="Noto Sans Ethiopic" w:cs="Noto Sans Ethiopic"/>
+          <w:sz w:val="20"/>
+          <w:szCs w:val="20"/>
+          <w:lang w:val="en-US"/>
+        </w:rPr>
+      </w:pPr>
+      <w:r>
+        <w:rPr>
+          <w:rFonts w:hint="default" w:ascii="Noto Sans Ethiopic" w:hAnsi="Noto Sans Ethiopic" w:cs="Noto Sans Ethiopic"/>
+          <w:sz w:val="20"/>
+          <w:szCs w:val="20"/>
+          <w:lang w:val="en-US"/>
+        </w:rPr>
+        <w:t>25.json - አንተ ያልከው ይሁን - not found</w:t>
+      </w:r>
+    </w:p>
+    <w:p>
+      <w:pPr>
+        <w:numPr>
+          <w:ilvl w:val="0"/>
+          <w:numId w:val="0"/>
+        </w:numPr>
+        <w:rPr>
+          <w:rFonts w:hint="default" w:ascii="Noto Sans Ethiopic" w:hAnsi="Noto Sans Ethiopic" w:cs="Noto Sans Ethiopic"/>
+          <w:sz w:val="20"/>
+          <w:szCs w:val="20"/>
+          <w:lang w:val="en-US"/>
+        </w:rPr>
+      </w:pPr>
+      <w:r>
+        <w:rPr>
+          <w:rFonts w:hint="default" w:ascii="Noto Sans Ethiopic" w:hAnsi="Noto Sans Ethiopic" w:cs="Noto Sans Ethiopic"/>
+          <w:sz w:val="20"/>
+          <w:szCs w:val="20"/>
+          <w:lang w:val="en-US"/>
+        </w:rPr>
+        <w:t>26.json - ያ ገበሬ - not found</w:t>
+      </w:r>
+    </w:p>
+    <w:p>
+      <w:pPr>
+        <w:numPr>
+          <w:ilvl w:val="0"/>
+          <w:numId w:val="0"/>
+        </w:numPr>
+        <w:rPr>
+          <w:rFonts w:hint="default" w:ascii="Noto Sans Ethiopic" w:hAnsi="Noto Sans Ethiopic" w:cs="Noto Sans Ethiopic"/>
+          <w:sz w:val="20"/>
+          <w:szCs w:val="20"/>
+          <w:lang w:val="en-US"/>
+        </w:rPr>
+      </w:pPr>
+      <w:r>
+        <w:rPr>
+          <w:rFonts w:hint="default" w:ascii="Noto Sans Ethiopic" w:hAnsi="Noto Sans Ethiopic" w:cs="Noto Sans Ethiopic"/>
+          <w:sz w:val="20"/>
+          <w:szCs w:val="20"/>
+          <w:lang w:val="en-US"/>
+        </w:rPr>
+        <w:t>27.json - ያገኘኝን አገኘሁት - not found</w:t>
+      </w:r>
+    </w:p>
+    <w:p>
+      <w:pPr>
+        <w:numPr>
+          <w:ilvl w:val="0"/>
+          <w:numId w:val="0"/>
+        </w:numPr>
+        <w:rPr>
+          <w:rFonts w:hint="default" w:ascii="Noto Sans Ethiopic" w:hAnsi="Noto Sans Ethiopic" w:cs="Noto Sans Ethiopic"/>
+          <w:sz w:val="20"/>
+          <w:szCs w:val="20"/>
+          <w:lang w:val="en-US"/>
+        </w:rPr>
+      </w:pPr>
+      <w:r>
+        <w:rPr>
+          <w:rFonts w:hint="default" w:ascii="Noto Sans Ethiopic" w:hAnsi="Noto Sans Ethiopic" w:cs="Noto Sans Ethiopic"/>
+          <w:sz w:val="20"/>
+          <w:szCs w:val="20"/>
+          <w:lang w:val="en-US"/>
+        </w:rPr>
+        <w:t>28.json - ይህ ያ ወራጅ ውኃ - not found</w:t>
+      </w:r>
+    </w:p>
+    <w:p>
+      <w:pPr>
+        <w:numPr>
+          <w:ilvl w:val="0"/>
+          <w:numId w:val="0"/>
+        </w:numPr>
+        <w:rPr>
+          <w:rFonts w:hint="default" w:ascii="Noto Sans Ethiopic" w:hAnsi="Noto Sans Ethiopic" w:cs="Noto Sans Ethiopic"/>
+          <w:sz w:val="20"/>
+          <w:szCs w:val="20"/>
+          <w:lang w:val="en-US"/>
+        </w:rPr>
+      </w:pPr>
+      <w:r>
+        <w:rPr>
+          <w:rFonts w:hint="default" w:ascii="Noto Sans Ethiopic" w:hAnsi="Noto Sans Ethiopic" w:cs="Noto Sans Ethiopic"/>
+          <w:sz w:val="20"/>
+          <w:szCs w:val="20"/>
+          <w:lang w:val="en-US"/>
+        </w:rPr>
+        <w:t>29.json - ድልድዩ አልከበደው - not found</w:t>
+      </w:r>
+    </w:p>
+    <w:p>
+      <w:pPr>
+        <w:numPr>
+          <w:ilvl w:val="0"/>
+          <w:numId w:val="0"/>
+        </w:numPr>
+        <w:rPr>
+          <w:rFonts w:hint="default" w:ascii="Noto Sans Ethiopic" w:hAnsi="Noto Sans Ethiopic" w:cs="Noto Sans Ethiopic"/>
+          <w:sz w:val="20"/>
+          <w:szCs w:val="20"/>
+          <w:lang w:val="en-US"/>
+        </w:rPr>
+      </w:pPr>
+      <w:r>
+        <w:rPr>
+          <w:rFonts w:hint="default" w:ascii="Noto Sans Ethiopic" w:hAnsi="Noto Sans Ethiopic" w:cs="Noto Sans Ethiopic"/>
+          <w:sz w:val="20"/>
+          <w:szCs w:val="20"/>
+          <w:lang w:val="en-US"/>
+        </w:rPr>
+        <w:t>30.json - ሰማሁኝ በዝና - not found</w:t>
+      </w:r>
+    </w:p>
+    <w:p>
+      <w:pPr>
+        <w:numPr>
+          <w:ilvl w:val="0"/>
+          <w:numId w:val="0"/>
+        </w:numPr>
+        <w:rPr>
+          <w:rFonts w:hint="default" w:ascii="Noto Sans Ethiopic" w:hAnsi="Noto Sans Ethiopic" w:cs="Noto Sans Ethiopic"/>
+          <w:sz w:val="20"/>
+          <w:szCs w:val="20"/>
+          <w:lang w:val="en-US"/>
+        </w:rPr>
+      </w:pPr>
+      <w:r>
+        <w:rPr>
+          <w:rFonts w:hint="default" w:ascii="Noto Sans Ethiopic" w:hAnsi="Noto Sans Ethiopic" w:cs="Noto Sans Ethiopic"/>
+          <w:sz w:val="20"/>
+          <w:szCs w:val="20"/>
+          <w:lang w:val="en-US"/>
+        </w:rPr>
+        <w:t>31.json - አምላኬ ነህ - not found</w:t>
+      </w:r>
+    </w:p>
+    <w:p>
+      <w:pPr>
+        <w:numPr>
+          <w:ilvl w:val="0"/>
+          <w:numId w:val="0"/>
+        </w:numPr>
+        <w:rPr>
+          <w:rFonts w:hint="default" w:ascii="Noto Sans Ethiopic" w:hAnsi="Noto Sans Ethiopic" w:cs="Noto Sans Ethiopic"/>
+          <w:sz w:val="20"/>
+          <w:szCs w:val="20"/>
+          <w:lang w:val="en-US"/>
+        </w:rPr>
+      </w:pPr>
+      <w:r>
+        <w:rPr>
+          <w:rFonts w:hint="default" w:ascii="Noto Sans Ethiopic" w:hAnsi="Noto Sans Ethiopic" w:cs="Noto Sans Ethiopic"/>
+          <w:sz w:val="20"/>
+          <w:szCs w:val="20"/>
+          <w:lang w:val="en-US"/>
+        </w:rPr>
+        <w:t>32.json - ያንተ ግን ይገርማል - not found</w:t>
+      </w:r>
+    </w:p>
+    <w:p>
+      <w:pPr>
+        <w:numPr>
+          <w:ilvl w:val="0"/>
+          <w:numId w:val="0"/>
+        </w:numPr>
+        <w:rPr>
+          <w:rFonts w:hint="default" w:ascii="Noto Sans Ethiopic" w:hAnsi="Noto Sans Ethiopic" w:cs="Noto Sans Ethiopic"/>
+          <w:sz w:val="20"/>
+          <w:szCs w:val="20"/>
+          <w:lang w:val="en-US"/>
+        </w:rPr>
+      </w:pPr>
+      <w:r>
+        <w:rPr>
+          <w:rFonts w:hint="default" w:ascii="Noto Sans Ethiopic" w:hAnsi="Noto Sans Ethiopic" w:cs="Noto Sans Ethiopic"/>
+          <w:sz w:val="20"/>
+          <w:szCs w:val="20"/>
+          <w:lang w:val="en-US"/>
+        </w:rPr>
+        <w:t>33.json - ቀዳማዊት ሔዋን - not found</w:t>
+      </w:r>
+    </w:p>
+    <w:p>
+      <w:pPr>
+        <w:numPr>
+          <w:ilvl w:val="0"/>
+          <w:numId w:val="0"/>
+        </w:numPr>
+        <w:rPr>
+          <w:rFonts w:hint="default" w:ascii="Noto Sans Ethiopic" w:hAnsi="Noto Sans Ethiopic" w:cs="Noto Sans Ethiopic"/>
+          <w:sz w:val="20"/>
+          <w:szCs w:val="20"/>
+          <w:lang w:val="en-US"/>
+        </w:rPr>
+      </w:pPr>
+      <w:r>
+        <w:rPr>
+          <w:rFonts w:hint="default" w:ascii="Noto Sans Ethiopic" w:hAnsi="Noto Sans Ethiopic" w:cs="Noto Sans Ethiopic"/>
+          <w:sz w:val="20"/>
+          <w:szCs w:val="20"/>
+          <w:lang w:val="en-US"/>
+        </w:rPr>
+        <w:t>34.json - በገዳዬ ምክር - not found</w:t>
+      </w:r>
+    </w:p>
+    <w:p>
+      <w:pPr>
+        <w:numPr>
+          <w:ilvl w:val="0"/>
+          <w:numId w:val="0"/>
+        </w:numPr>
+        <w:rPr>
+          <w:rFonts w:hint="default" w:ascii="Noto Sans Ethiopic" w:hAnsi="Noto Sans Ethiopic" w:cs="Noto Sans Ethiopic"/>
+          <w:sz w:val="20"/>
+          <w:szCs w:val="20"/>
+          <w:lang w:val="en-US"/>
+        </w:rPr>
+      </w:pPr>
+      <w:r>
+        <w:rPr>
+          <w:rFonts w:hint="default" w:ascii="Noto Sans Ethiopic" w:hAnsi="Noto Sans Ethiopic" w:cs="Noto Sans Ethiopic"/>
+          <w:sz w:val="20"/>
+          <w:szCs w:val="20"/>
+          <w:lang w:val="en-US"/>
+        </w:rPr>
+        <w:t>35.json - የእኛ ጌታ - not found</w:t>
+      </w:r>
+    </w:p>
+    <w:p>
+      <w:pPr>
+        <w:numPr>
+          <w:ilvl w:val="0"/>
+          <w:numId w:val="0"/>
+        </w:numPr>
+        <w:rPr>
+          <w:rFonts w:hint="default" w:ascii="Noto Sans Ethiopic" w:hAnsi="Noto Sans Ethiopic" w:cs="Noto Sans Ethiopic"/>
+          <w:sz w:val="20"/>
+          <w:szCs w:val="20"/>
+          <w:lang w:val="en-US"/>
+        </w:rPr>
+      </w:pPr>
+      <w:r>
+        <w:rPr>
+          <w:rFonts w:hint="default" w:ascii="Noto Sans Ethiopic" w:hAnsi="Noto Sans Ethiopic" w:cs="Noto Sans Ethiopic"/>
+          <w:sz w:val="20"/>
+          <w:szCs w:val="20"/>
+          <w:lang w:val="en-US"/>
+        </w:rPr>
+        <w:t>36.json - በዛ የብሶ - not found</w:t>
+      </w:r>
+    </w:p>
+    <w:p>
+      <w:pPr>
+        <w:numPr>
+          <w:ilvl w:val="0"/>
+          <w:numId w:val="0"/>
+        </w:numPr>
+        <w:rPr>
+          <w:rFonts w:hint="default" w:ascii="Noto Sans Ethiopic" w:hAnsi="Noto Sans Ethiopic" w:cs="Noto Sans Ethiopic"/>
+          <w:sz w:val="20"/>
+          <w:szCs w:val="20"/>
+          <w:lang w:val="en-US"/>
+        </w:rPr>
+      </w:pPr>
+      <w:r>
+        <w:rPr>
+          <w:rFonts w:hint="default" w:ascii="Noto Sans Ethiopic" w:hAnsi="Noto Sans Ethiopic" w:cs="Noto Sans Ethiopic"/>
+          <w:sz w:val="20"/>
+          <w:szCs w:val="20"/>
+          <w:lang w:val="en-US"/>
+        </w:rPr>
+        <w:t>37.json - ባሕር ብሻገርም - not found</w:t>
+      </w:r>
+    </w:p>
+    <w:p>
+      <w:pPr>
+        <w:numPr>
+          <w:ilvl w:val="0"/>
+          <w:numId w:val="0"/>
+        </w:numPr>
+        <w:rPr>
+          <w:rFonts w:hint="default" w:ascii="Noto Sans Ethiopic" w:hAnsi="Noto Sans Ethiopic" w:cs="Noto Sans Ethiopic"/>
+          <w:sz w:val="20"/>
+          <w:szCs w:val="20"/>
+          <w:lang w:val="en-US"/>
+        </w:rPr>
+      </w:pPr>
+      <w:r>
+        <w:rPr>
+          <w:rFonts w:hint="default" w:ascii="Noto Sans Ethiopic" w:hAnsi="Noto Sans Ethiopic" w:cs="Noto Sans Ethiopic"/>
+          <w:sz w:val="20"/>
+          <w:szCs w:val="20"/>
+          <w:lang w:val="en-US"/>
+        </w:rPr>
+        <w:t>38.json - ባሕር ብሻገርም2 - not found</w:t>
+      </w:r>
+    </w:p>
+    <w:p>
+      <w:pPr>
+        <w:numPr>
+          <w:numId w:val="0"/>
+        </w:numPr>
+        <w:rPr>
+          <w:rFonts w:hint="default" w:ascii="Noto Sans Ethiopic" w:hAnsi="Noto Sans Ethiopic" w:cs="Noto Sans Ethiopic"/>
+          <w:sz w:val="20"/>
+          <w:szCs w:val="20"/>
+          <w:lang w:val="en-US"/>
+        </w:rPr>
+      </w:pPr>
+    </w:p>
+    <w:p>
+      <w:pPr>
+        <w:numPr>
+          <w:numId w:val="0"/>
+        </w:numPr>
+        <w:rPr>
+          <w:rFonts w:hint="default" w:ascii="Noto Sans Ethiopic" w:hAnsi="Noto Sans Ethiopic" w:cs="Noto Sans Ethiopic"/>
+          <w:sz w:val="20"/>
+          <w:szCs w:val="20"/>
+          <w:lang w:val="en-US"/>
+        </w:rPr>
+      </w:pPr>
+    </w:p>
+    <w:p>
+      <w:pPr>
+        <w:numPr>
+          <w:numId w:val="0"/>
+        </w:numPr>
+        <w:rPr>
+          <w:rFonts w:hint="default" w:ascii="Noto Sans Ethiopic" w:hAnsi="Noto Sans Ethiopic" w:cs="Noto Sans Ethiopic"/>
+          <w:sz w:val="20"/>
+          <w:szCs w:val="20"/>
+          <w:lang w:val="en-US"/>
+        </w:rPr>
+      </w:pPr>
+      <w:r>
+        <w:rPr>
+          <w:rFonts w:hint="default" w:ascii="Noto Sans Ethiopic" w:hAnsi="Noto Sans Ethiopic" w:cs="Noto Sans Ethiopic"/>
+          <w:sz w:val="20"/>
+          <w:szCs w:val="20"/>
+          <w:lang w:val="en-US"/>
+        </w:rPr>
+        <w:t>ዘርፉ</w:t>
+      </w:r>
+    </w:p>
+    <w:p>
+      <w:pPr>
+        <w:numPr>
+          <w:numId w:val="0"/>
+        </w:numPr>
+        <w:rPr>
+          <w:rFonts w:hint="default" w:ascii="Noto Sans Ethiopic" w:hAnsi="Noto Sans Ethiopic" w:cs="Noto Sans Ethiopic"/>
+          <w:sz w:val="20"/>
+          <w:szCs w:val="20"/>
+          <w:lang w:val="en-US"/>
+        </w:rPr>
+      </w:pPr>
+      <w:r>
+        <w:rPr>
+          <w:rFonts w:hint="default" w:ascii="Noto Sans Ethiopic" w:hAnsi="Noto Sans Ethiopic" w:cs="Noto Sans Ethiopic"/>
+          <w:sz w:val="20"/>
+          <w:szCs w:val="20"/>
+          <w:lang w:val="en-US"/>
+        </w:rPr>
+        <w:t>8.json - የእመቤታችን ምስጋና</w:t>
+      </w:r>
+    </w:p>
+    <w:p>
+      <w:pPr>
+        <w:numPr>
+          <w:numId w:val="0"/>
+        </w:numPr>
+        <w:rPr>
+          <w:rFonts w:hint="default" w:ascii="Noto Sans Ethiopic" w:hAnsi="Noto Sans Ethiopic" w:cs="Noto Sans Ethiopic"/>
+          <w:sz w:val="20"/>
+          <w:szCs w:val="20"/>
+          <w:lang w:val="en-US"/>
+        </w:rPr>
+      </w:pPr>
+      <w:r>
+        <w:rPr>
+          <w:rFonts w:hint="default" w:ascii="Noto Sans Ethiopic" w:hAnsi="Noto Sans Ethiopic" w:cs="Noto Sans Ethiopic"/>
+          <w:sz w:val="20"/>
+          <w:szCs w:val="20"/>
+          <w:lang w:val="en-US"/>
+        </w:rPr>
+        <w:t>9. teweledeln - may need some edit on the gtm</w:t>
+      </w:r>
     </w:p>
     <w:sectPr>
       <w:pgSz w:w="11906" w:h="16838"/>

</xml_diff>